<commit_message>
ExLAW guns as deadly as in other settings; Mr. Power; Helios is David Carlysle Jones; psionic powers can't be swapped
Co-Authored-By: Claude Opus 5.5 <noreply@anthropic.com>
Claude-Session: https://claude.ai/code/session_015SADCFzhKijkC2foUmXrpC
</commit_message>
<xml_diff>
--- a/legend-dynamics/exlaw/ExLAW_Players_Guide.docx
+++ b/legend-dynamics/exlaw/ExLAW_Players_Guide.docx
@@ -6401,7 +6401,7 @@
               <w:rPr>
                 <w:sz w:val="19"/>
               </w:rPr>
-              <w:t xml:space="preserve">Fifteen rounds. Class I: hits mark 1 box.</w:t>
+              <w:t xml:space="preserve">Fifteen rounds. Class I; hits mark 2 boxes.</w:t>
             </w:r>
           </w:p>
         </w:tc>
@@ -6434,7 +6434,7 @@
               <w:rPr>
                 <w:sz w:val="19"/>
               </w:rPr>
-              <w:t xml:space="preserve">Six shells. Class I; at close range a hit marks 2 boxes.</w:t>
+              <w:t xml:space="preserve">Six shells. Class I. Within a few paces a hit marks 3 boxes and leaves the target Dying; farther away, 1 box.</w:t>
             </w:r>
           </w:p>
         </w:tc>
@@ -6467,7 +6467,7 @@
               <w:rPr>
                 <w:sz w:val="19"/>
               </w:rPr>
-              <w:t xml:space="preserve">Thirty rounds; can fire bursts. Class I.</w:t>
+              <w:t xml:space="preserve">Thirty rounds; can fire bursts. Class I; hits mark 2 boxes.</w:t>
             </w:r>
           </w:p>
         </w:tc>
@@ -6500,7 +6500,7 @@
               <w:rPr>
                 <w:sz w:val="19"/>
               </w:rPr>
-              <w:t xml:space="preserve">Twenty rounds; long range. Class I; a hit by 5 or more marks 2 boxes.</w:t>
+              <w:t xml:space="preserve">Twenty rounds; long range. Class I; hits mark 2 boxes.</w:t>
             </w:r>
           </w:p>
         </w:tc>
@@ -6599,7 +6599,7 @@
               <w:rPr>
                 <w:sz w:val="19"/>
               </w:rPr>
-              <w:t xml:space="preserve">Once per fight, a Class I hit marks no box.</w:t>
+              <w:t xml:space="preserve">Once per fight, a Class I hit marks one box fewer.</w:t>
             </w:r>
           </w:p>
         </w:tc>
@@ -7963,7 +7963,7 @@
         <w:pStyle w:val="BodyText"/>
       </w:pPr>
       <w:r>
-        <w:t xml:space="preserve">In ExLAW every attack has a</w:t>
+        <w:t xml:space="preserve">Ordinary weapons are as deadly here as anywhere: a gunshot is a gunshot. Every attack also has a</w:t>
       </w:r>
       <w:r>
         <w:t xml:space="preserve"> </w:t>
@@ -7976,23 +7976,55 @@
         <w:t xml:space="preserve">Class</w:t>
       </w:r>
       <w:r>
-        <w:t xml:space="preserve">, and the Class sets the damage:</w:t>
-      </w:r>
-      <w:r>
-        <w:t xml:space="preserve"> </w:t>
-      </w:r>
-      <w:r>
-        <w:rPr>
-          <w:bCs/>
-          <w:b/>
-        </w:rPr>
-        <w:t xml:space="preserve">Class I marks 1 box, Class II marks 2, Class III marks 2 and knocks the target down, Class IV and above mark 3.</w:t>
-      </w:r>
-      <w:r>
-        <w:t xml:space="preserve"> </w:t>
-      </w:r>
-      <w:r>
-        <w:t xml:space="preserve">Ordinary weapons are Class I; powers and heavy weapons go higher (see</w:t>
+        <w:t xml:space="preserve">, which matters against an Operant’s</w:t>
+      </w:r>
+      <w:r>
+        <w:t xml:space="preserve"> </w:t>
+      </w:r>
+      <w:r>
+        <w:rPr>
+          <w:bCs/>
+          <w:b/>
+        </w:rPr>
+        <w:t xml:space="preserve">Defense</w:t>
+      </w:r>
+      <w:r>
+        <w:t xml:space="preserve"> </w:t>
+      </w:r>
+      <w:r>
+        <w:t xml:space="preserve">(see below).</w:t>
+      </w:r>
+      <w:r>
+        <w:t xml:space="preserve"> </w:t>
+      </w:r>
+      <w:r>
+        <w:rPr>
+          <w:bCs/>
+          <w:b/>
+        </w:rPr>
+        <w:t xml:space="preserve">Powers</w:t>
+      </w:r>
+      <w:r>
+        <w:t xml:space="preserve"> </w:t>
+      </w:r>
+      <w:r>
+        <w:t xml:space="preserve">mark boxes by their Class:</w:t>
+      </w:r>
+      <w:r>
+        <w:t xml:space="preserve"> </w:t>
+      </w:r>
+      <w:r>
+        <w:rPr>
+          <w:bCs/>
+          <w:b/>
+        </w:rPr>
+        <w:t xml:space="preserve">Class I marks 1 box, Class II marks 2, Class III marks 2 and knocks the target down, Class IV and above mark 3</w:t>
+      </w:r>
+      <w:r>
+        <w:t xml:space="preserve"> </w:t>
+      </w:r>
+      <w:r>
+        <w:t xml:space="preserve">(see</w:t>
       </w:r>
       <w:r>
         <w:t xml:space="preserve"> </w:t>
@@ -8101,25 +8133,25 @@
                 <w:b/>
                 <w:sz w:val="19"/>
               </w:rPr>
-              <w:t xml:space="preserve">Notes</w:t>
-            </w:r>
-          </w:p>
-        </w:tc>
-      </w:tr>
-      <w:tr>
-        <w:tc>
-          <w:tcPr/>
-          <w:p>
-            <w:pPr>
-              <w:pStyle w:val="Compact"/>
-              <w:jc w:val="left"/>
-            </w:pPr>
-            <w:r>
-              <w:rPr>
-                <w:b/>
-                <w:sz w:val="19"/>
-              </w:rPr>
-              <w:t xml:space="preserve">Fists, kicks, a baton or knife</w:t>
+              <w:t xml:space="preserve">What the injury looks like</w:t>
+            </w:r>
+          </w:p>
+        </w:tc>
+      </w:tr>
+      <w:tr>
+        <w:tc>
+          <w:tcPr/>
+          <w:p>
+            <w:pPr>
+              <w:pStyle w:val="Compact"/>
+              <w:jc w:val="left"/>
+            </w:pPr>
+            <w:r>
+              <w:rPr>
+                <w:b/>
+                <w:sz w:val="19"/>
+              </w:rPr>
+              <w:t xml:space="preserve">Fists, kicks, a baton</w:t>
             </w:r>
           </w:p>
         </w:tc>
@@ -8164,25 +8196,25 @@
               <w:rPr>
                 <w:sz w:val="19"/>
               </w:rPr>
-              <w:t xml:space="preserve">Powers such as Strength and Natural Weapons raise the Class</w:t>
-            </w:r>
-          </w:p>
-        </w:tc>
-      </w:tr>
-      <w:tr>
-        <w:tc>
-          <w:tcPr/>
-          <w:p>
-            <w:pPr>
-              <w:pStyle w:val="Compact"/>
-              <w:jc w:val="left"/>
-            </w:pPr>
-            <w:r>
-              <w:rPr>
-                <w:b/>
-                <w:sz w:val="19"/>
-              </w:rPr>
-              <w:t xml:space="preserve">Pistol, submachine gun</w:t>
+              <w:t xml:space="preserve">Bruises, a cracked rib, a concussion</w:t>
+            </w:r>
+          </w:p>
+        </w:tc>
+      </w:tr>
+      <w:tr>
+        <w:tc>
+          <w:tcPr/>
+          <w:p>
+            <w:pPr>
+              <w:pStyle w:val="Compact"/>
+              <w:jc w:val="left"/>
+            </w:pPr>
+            <w:r>
+              <w:rPr>
+                <w:b/>
+                <w:sz w:val="19"/>
+              </w:rPr>
+              <w:t xml:space="preserve">Knife</w:t>
             </w:r>
           </w:p>
         </w:tc>
@@ -8227,25 +8259,25 @@
               <w:rPr>
                 <w:sz w:val="19"/>
               </w:rPr>
-              <w:t xml:space="preserve">A burst (SMG, three rounds) gives +1 to hit</w:t>
-            </w:r>
-          </w:p>
-        </w:tc>
-      </w:tr>
-      <w:tr>
-        <w:tc>
-          <w:tcPr/>
-          <w:p>
-            <w:pPr>
-              <w:pStyle w:val="Compact"/>
-              <w:jc w:val="left"/>
-            </w:pPr>
-            <w:r>
-              <w:rPr>
-                <w:b/>
-                <w:sz w:val="19"/>
-              </w:rPr>
-              <w:t xml:space="preserve">Shotgun</w:t>
+              <w:t xml:space="preserve">A cut or stab wound</w:t>
+            </w:r>
+          </w:p>
+        </w:tc>
+      </w:tr>
+      <w:tr>
+        <w:tc>
+          <w:tcPr/>
+          <w:p>
+            <w:pPr>
+              <w:pStyle w:val="Compact"/>
+              <w:jc w:val="left"/>
+            </w:pPr>
+            <w:r>
+              <w:rPr>
+                <w:b/>
+                <w:sz w:val="19"/>
+              </w:rPr>
+              <w:t xml:space="preserve">Pistol, submachine gun or rifle</w:t>
             </w:r>
           </w:p>
         </w:tc>
@@ -8275,33 +8307,40 @@
               <w:rPr>
                 <w:sz w:val="19"/>
               </w:rPr>
-              <w:t xml:space="preserve">1, or 2 at close range</w:t>
-            </w:r>
-          </w:p>
-        </w:tc>
-        <w:tc>
-          <w:tcPr/>
-          <w:p>
-            <w:pPr>
-              <w:pStyle w:val="Compact"/>
-            </w:pPr>
-          </w:p>
-        </w:tc>
-      </w:tr>
-      <w:tr>
-        <w:tc>
-          <w:tcPr/>
-          <w:p>
-            <w:pPr>
-              <w:pStyle w:val="Compact"/>
-              <w:jc w:val="left"/>
-            </w:pPr>
-            <w:r>
-              <w:rPr>
-                <w:b/>
-                <w:sz w:val="19"/>
-              </w:rPr>
-              <w:t xml:space="preserve">Rifle</w:t>
+              <w:t xml:space="preserve">2</w:t>
+            </w:r>
+          </w:p>
+        </w:tc>
+        <w:tc>
+          <w:tcPr/>
+          <w:p>
+            <w:pPr>
+              <w:pStyle w:val="Compact"/>
+              <w:jc w:val="left"/>
+            </w:pPr>
+            <w:r>
+              <w:rPr>
+                <w:sz w:val="19"/>
+              </w:rPr>
+              <w:t xml:space="preserve">A gunshot wound</w:t>
+            </w:r>
+          </w:p>
+        </w:tc>
+      </w:tr>
+      <w:tr>
+        <w:tc>
+          <w:tcPr/>
+          <w:p>
+            <w:pPr>
+              <w:pStyle w:val="Compact"/>
+              <w:jc w:val="left"/>
+            </w:pPr>
+            <w:r>
+              <w:rPr>
+                <w:b/>
+                <w:sz w:val="19"/>
+              </w:rPr>
+              <w:t xml:space="preserve">Shotgun, within a few paces</w:t>
             </w:r>
           </w:p>
         </w:tc>
@@ -8331,22 +8370,148 @@
               <w:rPr>
                 <w:sz w:val="19"/>
               </w:rPr>
-              <w:t xml:space="preserve">1, or 2 on a hit by 5 or more</w:t>
-            </w:r>
-          </w:p>
-        </w:tc>
-        <w:tc>
-          <w:tcPr/>
-          <w:p>
-            <w:pPr>
-              <w:pStyle w:val="Compact"/>
-              <w:jc w:val="left"/>
-            </w:pPr>
-            <w:r>
-              <w:rPr>
-                <w:sz w:val="19"/>
-              </w:rPr>
-              <w:t xml:space="preserve">Long range</w:t>
+              <w:t xml:space="preserve">3, and Dying</w:t>
+            </w:r>
+          </w:p>
+        </w:tc>
+        <w:tc>
+          <w:tcPr/>
+          <w:p>
+            <w:pPr>
+              <w:pStyle w:val="Compact"/>
+              <w:jc w:val="left"/>
+            </w:pPr>
+            <w:r>
+              <w:rPr>
+                <w:sz w:val="19"/>
+              </w:rPr>
+              <w:t xml:space="preserve">A ruinous wound</w:t>
+            </w:r>
+          </w:p>
+        </w:tc>
+      </w:tr>
+      <w:tr>
+        <w:tc>
+          <w:tcPr/>
+          <w:p>
+            <w:pPr>
+              <w:pStyle w:val="Compact"/>
+              <w:jc w:val="left"/>
+            </w:pPr>
+            <w:r>
+              <w:rPr>
+                <w:b/>
+                <w:sz w:val="19"/>
+              </w:rPr>
+              <w:t xml:space="preserve">Shotgun, farther away</w:t>
+            </w:r>
+          </w:p>
+        </w:tc>
+        <w:tc>
+          <w:tcPr/>
+          <w:p>
+            <w:pPr>
+              <w:pStyle w:val="Compact"/>
+              <w:jc w:val="left"/>
+            </w:pPr>
+            <w:r>
+              <w:rPr>
+                <w:sz w:val="19"/>
+              </w:rPr>
+              <w:t xml:space="preserve">I</w:t>
+            </w:r>
+          </w:p>
+        </w:tc>
+        <w:tc>
+          <w:tcPr/>
+          <w:p>
+            <w:pPr>
+              <w:pStyle w:val="Compact"/>
+              <w:jc w:val="left"/>
+            </w:pPr>
+            <w:r>
+              <w:rPr>
+                <w:sz w:val="19"/>
+              </w:rPr>
+              <w:t xml:space="preserve">1</w:t>
+            </w:r>
+          </w:p>
+        </w:tc>
+        <w:tc>
+          <w:tcPr/>
+          <w:p>
+            <w:pPr>
+              <w:pStyle w:val="Compact"/>
+              <w:jc w:val="left"/>
+            </w:pPr>
+            <w:r>
+              <w:rPr>
+                <w:sz w:val="19"/>
+              </w:rPr>
+              <w:t xml:space="preserve">Scattered pellets</w:t>
+            </w:r>
+          </w:p>
+        </w:tc>
+      </w:tr>
+      <w:tr>
+        <w:tc>
+          <w:tcPr/>
+          <w:p>
+            <w:pPr>
+              <w:pStyle w:val="Compact"/>
+              <w:jc w:val="left"/>
+            </w:pPr>
+            <w:r>
+              <w:rPr>
+                <w:b/>
+                <w:sz w:val="19"/>
+              </w:rPr>
+              <w:t xml:space="preserve">Sniper or heavy rifle</w:t>
+            </w:r>
+          </w:p>
+        </w:tc>
+        <w:tc>
+          <w:tcPr/>
+          <w:p>
+            <w:pPr>
+              <w:pStyle w:val="Compact"/>
+              <w:jc w:val="left"/>
+            </w:pPr>
+            <w:r>
+              <w:rPr>
+                <w:sz w:val="19"/>
+              </w:rPr>
+              <w:t xml:space="preserve">II</w:t>
+            </w:r>
+          </w:p>
+        </w:tc>
+        <w:tc>
+          <w:tcPr/>
+          <w:p>
+            <w:pPr>
+              <w:pStyle w:val="Compact"/>
+              <w:jc w:val="left"/>
+            </w:pPr>
+            <w:r>
+              <w:rPr>
+                <w:sz w:val="19"/>
+              </w:rPr>
+              <w:t xml:space="preserve">3, and Dying</w:t>
+            </w:r>
+          </w:p>
+        </w:tc>
+        <w:tc>
+          <w:tcPr/>
+          <w:p>
+            <w:pPr>
+              <w:pStyle w:val="Compact"/>
+              <w:jc w:val="left"/>
+            </w:pPr>
+            <w:r>
+              <w:rPr>
+                <w:sz w:val="19"/>
+              </w:rPr>
+              <w:t xml:space="preserve">A ruinous wound</w:t>
             </w:r>
           </w:p>
         </w:tc>
@@ -8409,7 +8574,7 @@
               <w:rPr>
                 <w:sz w:val="19"/>
               </w:rPr>
-              <w:t xml:space="preserve">Two shots</w:t>
+              <w:t xml:space="preserve">Twitching, then unconsciousness</w:t>
             </w:r>
           </w:p>
         </w:tc>
@@ -8513,22 +8678,22 @@
               <w:rPr>
                 <w:sz w:val="19"/>
               </w:rPr>
-              <w:t xml:space="preserve">2 and knocked down</w:t>
-            </w:r>
-          </w:p>
-        </w:tc>
-        <w:tc>
-          <w:tcPr/>
-          <w:p>
-            <w:pPr>
-              <w:pStyle w:val="Compact"/>
-              <w:jc w:val="left"/>
-            </w:pPr>
-            <w:r>
-              <w:rPr>
-                <w:sz w:val="19"/>
-              </w:rPr>
-              <w:t xml:space="preserve">Everyone nearby takes 1 box</w:t>
+              <w:t xml:space="preserve">3 and Dying at the center; 1 to everyone nearby</w:t>
+            </w:r>
+          </w:p>
+        </w:tc>
+        <w:tc>
+          <w:tcPr/>
+          <w:p>
+            <w:pPr>
+              <w:pStyle w:val="Compact"/>
+              <w:jc w:val="left"/>
+            </w:pPr>
+            <w:r>
+              <w:rPr>
+                <w:sz w:val="19"/>
+              </w:rPr>
+              <w:t xml:space="preserve">Blast and shrapnel; Dodge means diving clear</w:t>
             </w:r>
           </w:p>
         </w:tc>
@@ -8591,7 +8756,7 @@
               <w:rPr>
                 <w:sz w:val="19"/>
               </w:rPr>
-              <w:t xml:space="preserve">Toughness doesn’t help with falls from orbit</w:t>
+              <w:t xml:space="preserve">A sprain or a fracture</w:t>
             </w:r>
           </w:p>
         </w:tc>
@@ -8648,7 +8813,14 @@
           <w:p>
             <w:pPr>
               <w:pStyle w:val="Compact"/>
-            </w:pPr>
+              <w:jc w:val="left"/>
+            </w:pPr>
+            <w:r>
+              <w:rPr>
+                <w:sz w:val="19"/>
+              </w:rPr>
+              <w:t xml:space="preserve">Burns</w:t>
+            </w:r>
           </w:p>
         </w:tc>
       </w:tr>
@@ -8684,7 +8856,7 @@
         <w:t xml:space="preserve"> </w:t>
       </w:r>
       <w:r>
-        <w:t xml:space="preserve">Class. An attack</w:t>
+        <w:t xml:space="preserve">Class. An attack whose Class is</w:t>
       </w:r>
       <w:r>
         <w:t xml:space="preserve"> </w:t>
@@ -8700,7 +8872,7 @@
         <w:t xml:space="preserve"> </w:t>
       </w:r>
       <w:r>
-        <w:t xml:space="preserve">your Defense hits in full; an attack</w:t>
+        <w:t xml:space="preserve">your Defense hits in full; one</w:t>
       </w:r>
       <w:r>
         <w:t xml:space="preserve"> </w:t>
@@ -8716,7 +8888,7 @@
         <w:t xml:space="preserve"> </w:t>
       </w:r>
       <w:r>
-        <w:t xml:space="preserve">to it marks one box fewer; an attack</w:t>
+        <w:t xml:space="preserve">to it marks one box fewer; one</w:t>
       </w:r>
       <w:r>
         <w:t xml:space="preserve"> </w:t>
@@ -8732,7 +8904,7 @@
         <w:t xml:space="preserve"> </w:t>
       </w:r>
       <w:r>
-        <w:t xml:space="preserve">it does nothing. A bulletproof Operant (Defense II) ignores pistols, and an Aegis cannon still bruises them.</w:t>
+        <w:t xml:space="preserve">it does nothing. A bulletproof Operant (Defense II) ignores pistols and rifles, and an Aegis cannon still marks a box.</w:t>
       </w:r>
     </w:p>
     <w:p>
@@ -8750,7 +8922,7 @@
         <w:t xml:space="preserve"> </w:t>
       </w:r>
       <w:r>
-        <w:t xml:space="preserve">a gang member’s pistol shot hits Sheriff Wade Collier. It’s Class I against his Toughness II: it does nothing, and the gang member starts to run. A White Hand soldier’s Class II Blast is equal to his Defense, so it marks one box instead of two.</w:t>
+        <w:t xml:space="preserve">a gang member’s pistol shot hits Sheriff Wade Collier. It’s Class I against his Toughness II: it does nothing, and the gang member starts to run. The same shot would have marked two boxes on his deputy. A White Hand soldier’s Class II Blast is equal to his Defense, so it marks one box instead of two.</w:t>
       </w:r>
     </w:p>
     <w:p>
@@ -8758,7 +8930,23 @@
         <w:pStyle w:val="BodyText"/>
       </w:pPr>
       <w:r>
-        <w:t xml:space="preserve">Firearms jam on a natural 18. To take someone down without killing them, use fists, a taser, dampening cuffs, or a power used with care.</w:t>
+        <w:t xml:space="preserve">A submachine gun can fire a</w:t>
+      </w:r>
+      <w:r>
+        <w:t xml:space="preserve"> </w:t>
+      </w:r>
+      <w:r>
+        <w:rPr>
+          <w:bCs/>
+          <w:b/>
+        </w:rPr>
+        <w:t xml:space="preserve">burst</w:t>
+      </w:r>
+      <w:r>
+        <w:t xml:space="preserve"> </w:t>
+      </w:r>
+      <w:r>
+        <w:t xml:space="preserve">(three rounds, +1 to hit). Firearms jam on a natural 18. To take someone down without killing them, use fists, a taser, dampening cuffs, or a power used with care.</w:t>
       </w:r>
     </w:p>
     <w:bookmarkEnd w:id="54"/>
@@ -13104,7 +13292,7 @@
         <w:t xml:space="preserve">Johnny Vanroy</w:t>
       </w:r>
       <w:r>
-        <w:t xml:space="preserve">, Wonder Man, was arrested for the murder of heiress Lita Weston. He was cleared, but left ExLAW in 1978, and the EPAOC never stopped accusing Hamilton of favoritism. By</w:t>
+        <w:t xml:space="preserve">, Mr. Power, was arrested for the murder of heiress Lita Weston. He was cleared, but left ExLAW in 1978, and the EPAOC never stopped accusing Hamilton of favoritism. By</w:t>
       </w:r>
       <w:r>
         <w:t xml:space="preserve"> </w:t>
@@ -15294,7 +15482,20 @@
         <w:t xml:space="preserve"> </w:t>
       </w:r>
       <w:r>
-        <w:t xml:space="preserve">Class I marks 1 box, Class II marks 2, Class III marks 2 and knocks the target down, Class IV and above mark 3.</w:t>
+        <w:t xml:space="preserve">A power marks boxes by its Class: Class I marks 1 box, Class II marks 2, Class III marks 2 and knocks the target down, Class IV and above mark 3. Ordinary weapons mark the boxes in their table (see</w:t>
+      </w:r>
+      <w:r>
+        <w:t xml:space="preserve"> </w:t>
+      </w:r>
+      <w:r>
+        <w:rPr>
+          <w:iCs/>
+          <w:i/>
+        </w:rPr>
+        <w:t xml:space="preserve">Personal combat</w:t>
+      </w:r>
+      <w:r>
+        <w:t xml:space="preserve">).</w:t>
       </w:r>
     </w:p>
     <w:p>
@@ -21674,7 +21875,7 @@
           <w:bCs/>
           <w:b/>
         </w:rPr>
-        <w:t xml:space="preserve">Helios (David Marcus Mars), 44.</w:t>
+        <w:t xml:space="preserve">Helios (David Carlysle Jones), 44.</w:t>
       </w:r>
       <w:r>
         <w:t xml:space="preserve"> </w:t>

</xml_diff>

<commit_message>
ExLAW: Speed and Flight escalate to multiples of the speed of sound (Classes I-VI)
Co-Authored-By: Claude Opus 5.5 <noreply@anthropic.com>
Claude-Session: https://claude.ai/code/session_015SADCFzhKijkC2foUmXrpC
</commit_message>
<xml_diff>
--- a/legend-dynamics/exlaw/ExLAW_Players_Guide.docx
+++ b/legend-dynamics/exlaw/ExLAW_Players_Guide.docx
@@ -15349,7 +15349,7 @@
     </w:p>
     <w:bookmarkEnd w:id="80"/>
     <w:bookmarkEnd w:id="81"/>
-    <w:bookmarkStart w:id="92" w:name="powers"/>
+    <w:bookmarkStart w:id="93" w:name="powers"/>
     <w:p>
       <w:pPr>
         <w:pStyle w:val="Heading1"/>
@@ -17102,37 +17102,37 @@
               <w:rPr>
                 <w:sz w:val="19"/>
               </w:rPr>
-              <w:t xml:space="preserve">Run as fast as a car; act first in any round.</w:t>
-            </w:r>
-          </w:p>
-        </w:tc>
-        <w:tc>
-          <w:tcPr/>
-          <w:p>
-            <w:pPr>
-              <w:pStyle w:val="Compact"/>
-              <w:jc w:val="left"/>
-            </w:pPr>
-            <w:r>
-              <w:rPr>
-                <w:sz w:val="19"/>
-              </w:rPr>
-              <w:t xml:space="preserve">Highway speeds and across water; two moves a round.</w:t>
-            </w:r>
-          </w:p>
-        </w:tc>
-        <w:tc>
-          <w:tcPr/>
-          <w:p>
-            <w:pPr>
-              <w:pStyle w:val="Compact"/>
-              <w:jc w:val="left"/>
-            </w:pPr>
-            <w:r>
-              <w:rPr>
-                <w:sz w:val="19"/>
-              </w:rPr>
-              <w:t xml:space="preserve">Near the speed of sound; once a scene, two actions in a round.</w:t>
+              <w:t xml:space="preserve">Up to 70 mph, as fast as a car; act first in any round.</w:t>
+            </w:r>
+          </w:p>
+        </w:tc>
+        <w:tc>
+          <w:tcPr/>
+          <w:p>
+            <w:pPr>
+              <w:pStyle w:val="Compact"/>
+              <w:jc w:val="left"/>
+            </w:pPr>
+            <w:r>
+              <w:rPr>
+                <w:sz w:val="19"/>
+              </w:rPr>
+              <w:t xml:space="preserve">Up to 200 mph; run across water and up walls; two moves a round.</w:t>
+            </w:r>
+          </w:p>
+        </w:tc>
+        <w:tc>
+          <w:tcPr/>
+          <w:p>
+            <w:pPr>
+              <w:pStyle w:val="Compact"/>
+              <w:jc w:val="left"/>
+            </w:pPr>
+            <w:r>
+              <w:rPr>
+                <w:sz w:val="19"/>
+              </w:rPr>
+              <w:t xml:space="preserve">Mach 1 (about 760 mph); once a scene, two actions in a round.</w:t>
             </w:r>
           </w:p>
         </w:tc>
@@ -17166,37 +17166,37 @@
               <w:rPr>
                 <w:sz w:val="19"/>
               </w:rPr>
-              <w:t xml:space="preserve">Fly at running speed.</w:t>
-            </w:r>
-          </w:p>
-        </w:tc>
-        <w:tc>
-          <w:tcPr/>
-          <w:p>
-            <w:pPr>
-              <w:pStyle w:val="Compact"/>
-              <w:jc w:val="left"/>
-            </w:pPr>
-            <w:r>
-              <w:rPr>
-                <w:sz w:val="19"/>
-              </w:rPr>
-              <w:t xml:space="preserve">Fly at car speed.</w:t>
-            </w:r>
-          </w:p>
-        </w:tc>
-        <w:tc>
-          <w:tcPr/>
-          <w:p>
-            <w:pPr>
-              <w:pStyle w:val="Compact"/>
-              <w:jc w:val="left"/>
-            </w:pPr>
-            <w:r>
-              <w:rPr>
-                <w:sz w:val="19"/>
-              </w:rPr>
-              <w:t xml:space="preserve">Fly beside jets.</w:t>
+              <w:t xml:space="preserve">Fly up to 70 mph, as fast as a car.</w:t>
+            </w:r>
+          </w:p>
+        </w:tc>
+        <w:tc>
+          <w:tcPr/>
+          <w:p>
+            <w:pPr>
+              <w:pStyle w:val="Compact"/>
+              <w:jc w:val="left"/>
+            </w:pPr>
+            <w:r>
+              <w:rPr>
+                <w:sz w:val="19"/>
+              </w:rPr>
+              <w:t xml:space="preserve">Fly up to 300 mph, as fast as a light plane.</w:t>
+            </w:r>
+          </w:p>
+        </w:tc>
+        <w:tc>
+          <w:tcPr/>
+          <w:p>
+            <w:pPr>
+              <w:pStyle w:val="Compact"/>
+              <w:jc w:val="left"/>
+            </w:pPr>
+            <w:r>
+              <w:rPr>
+                <w:sz w:val="19"/>
+              </w:rPr>
+              <w:t xml:space="preserve">Mach 2 (about 1,500 mph): keep up with fighter jets.</w:t>
             </w:r>
           </w:p>
         </w:tc>
@@ -19915,13 +19915,13 @@
       </w:tr>
     </w:tbl>
     <w:bookmarkEnd w:id="88"/>
-    <w:bookmarkStart w:id="89" w:name="rituals"/>
+    <w:bookmarkStart w:id="89" w:name="escalated-classes"/>
     <w:p>
       <w:pPr>
         <w:pStyle w:val="Heading2"/>
       </w:pPr>
       <w:r>
-        <w:t xml:space="preserve">Rituals</w:t>
+        <w:t xml:space="preserve">Escalated Classes</w:t>
       </w:r>
     </w:p>
     <w:p>
@@ -19929,414 +19929,7 @@
         <w:pStyle w:val="FirstParagraph"/>
       </w:pPr>
       <w:r>
-        <w:t xml:space="preserve">Adepts can</w:t>
-      </w:r>
-      <w:r>
-        <w:t xml:space="preserve"> </w:t>
-      </w:r>
-      <w:r>
-        <w:rPr>
-          <w:bCs/>
-          <w:b/>
-        </w:rPr>
-        <w:t xml:space="preserve">emulate any power by ritual</w:t>
-      </w:r>
-      <w:r>
-        <w:t xml:space="preserve">, at any Class up to their own highest.</w:t>
-      </w:r>
-    </w:p>
-    <w:p>
-      <w:pPr>
-        <w:numPr>
-          <w:ilvl w:val="0"/>
-          <w:numId w:val="1017"/>
-        </w:numPr>
-        <w:pStyle w:val="Compact"/>
-      </w:pPr>
-      <w:r>
-        <w:rPr>
-          <w:bCs/>
-          <w:b/>
-        </w:rPr>
-        <w:t xml:space="preserve">Time:</w:t>
-      </w:r>
-      <w:r>
-        <w:t xml:space="preserve"> </w:t>
-      </w:r>
-      <w:r>
-        <w:t xml:space="preserve">Class I takes ten minutes, Class II an hour, Class III a night. A ritual can’t be done in the middle of a fight.</w:t>
-      </w:r>
-    </w:p>
-    <w:p>
-      <w:pPr>
-        <w:numPr>
-          <w:ilvl w:val="0"/>
-          <w:numId w:val="1017"/>
-        </w:numPr>
-        <w:pStyle w:val="Compact"/>
-      </w:pPr>
-      <w:r>
-        <w:rPr>
-          <w:bCs/>
-          <w:b/>
-        </w:rPr>
-        <w:t xml:space="preserve">The roll:</w:t>
-      </w:r>
-      <w:r>
-        <w:t xml:space="preserve"> </w:t>
-      </w:r>
-      <w:r>
-        <w:t xml:space="preserve">Powers, at −2 for Class II and −4 for Class III.</w:t>
-      </w:r>
-    </w:p>
-    <w:p>
-      <w:pPr>
-        <w:numPr>
-          <w:ilvl w:val="0"/>
-          <w:numId w:val="1017"/>
-        </w:numPr>
-        <w:pStyle w:val="Compact"/>
-      </w:pPr>
-      <w:r>
-        <w:rPr>
-          <w:bCs/>
-          <w:b/>
-        </w:rPr>
-        <w:t xml:space="preserve">Effect:</w:t>
-      </w:r>
-      <w:r>
-        <w:t xml:space="preserve"> </w:t>
-      </w:r>
-      <w:r>
-        <w:t xml:space="preserve">the power works once, or for one scene, as the GM judges, and can be cast on someone else.</w:t>
-      </w:r>
-    </w:p>
-    <w:p>
-      <w:pPr>
-        <w:numPr>
-          <w:ilvl w:val="0"/>
-          <w:numId w:val="1017"/>
-        </w:numPr>
-        <w:pStyle w:val="Compact"/>
-      </w:pPr>
-      <w:r>
-        <w:rPr>
-          <w:bCs/>
-          <w:b/>
-        </w:rPr>
-        <w:t xml:space="preserve">Cost:</w:t>
-      </w:r>
-      <w:r>
-        <w:t xml:space="preserve"> </w:t>
-      </w:r>
-      <w:r>
-        <w:t xml:space="preserve">a failed ritual marks a box of Strain. A natural 18 means something answered that shouldn’t have.</w:t>
-      </w:r>
-    </w:p>
-    <w:p>
-      <w:pPr>
-        <w:numPr>
-          <w:ilvl w:val="0"/>
-          <w:numId w:val="1017"/>
-        </w:numPr>
-        <w:pStyle w:val="Compact"/>
-      </w:pPr>
-      <w:r>
-        <w:t xml:space="preserve">Rituals for (GM) powers still need the GM’s approval.</w:t>
-      </w:r>
-    </w:p>
-    <w:p>
-      <w:pPr>
-        <w:pStyle w:val="FirstParagraph"/>
-      </w:pPr>
-      <w:r>
-        <w:rPr>
-          <w:bCs/>
-          <w:b/>
-        </w:rPr>
-        <w:t xml:space="preserve">Materials.</w:t>
-      </w:r>
-      <w:r>
-        <w:t xml:space="preserve"> </w:t>
-      </w:r>
-      <w:r>
-        <w:t xml:space="preserve">Every ritual needs specialized materials, matched to the power: a hawk’s feather and storm water for Flight, a mirror silvered with mercury for Illusion, grave dirt for Summoning.</w:t>
-      </w:r>
-    </w:p>
-    <w:tbl>
-      <w:tblPr>
-        <w:tblStyle w:val="Table"/>
-        <w:tblW w:type="pct" w:w="5000"/>
-        <w:tblLook w:firstRow="1" w:lastRow="0" w:firstColumn="0" w:lastColumn="0" w:noHBand="0" w:noVBand="0" w:val="0020"/>
-        <w:jc w:val="start"/>
-        <w:tblBorders>
-          <w:top w:val="single" w:sz="4" w:color="B8C2D3"/>
-          <w:left w:val="single" w:sz="4" w:color="B8C2D3"/>
-          <w:bottom w:val="single" w:sz="4" w:color="B8C2D3"/>
-          <w:right w:val="single" w:sz="4" w:color="B8C2D3"/>
-          <w:insideH w:val="single" w:sz="4" w:color="B8C2D3"/>
-          <w:insideV w:val="single" w:sz="4" w:color="B8C2D3"/>
-        </w:tblBorders>
-      </w:tblPr>
-      <w:tblGrid>
-        <w:gridCol w:w="2640"/>
-        <w:gridCol w:w="2640"/>
-        <w:gridCol w:w="2640"/>
-      </w:tblGrid>
-      <w:tr>
-        <w:trPr>
-          <w:tblHeader w:val="true"/>
-        </w:trPr>
-        <w:tc>
-          <w:tcPr>
-            <w:shd w:val="clear" w:fill="E8EEF8"/>
-          </w:tcPr>
-          <w:p>
-            <w:pPr>
-              <w:pStyle w:val="Compact"/>
-              <w:jc w:val="left"/>
-            </w:pPr>
-            <w:r>
-              <w:rPr>
-                <w:b/>
-                <w:sz w:val="19"/>
-              </w:rPr>
-              <w:t xml:space="preserve">Class</w:t>
-            </w:r>
-          </w:p>
-        </w:tc>
-        <w:tc>
-          <w:tcPr>
-            <w:shd w:val="clear" w:fill="E8EEF8"/>
-          </w:tcPr>
-          <w:p>
-            <w:pPr>
-              <w:pStyle w:val="Compact"/>
-              <w:jc w:val="left"/>
-            </w:pPr>
-            <w:r>
-              <w:rPr>
-                <w:b/>
-                <w:sz w:val="19"/>
-              </w:rPr>
-              <w:t xml:space="preserve">Materials</w:t>
-            </w:r>
-          </w:p>
-        </w:tc>
-        <w:tc>
-          <w:tcPr>
-            <w:shd w:val="clear" w:fill="E8EEF8"/>
-          </w:tcPr>
-          <w:p>
-            <w:pPr>
-              <w:pStyle w:val="Compact"/>
-              <w:jc w:val="left"/>
-            </w:pPr>
-            <w:r>
-              <w:rPr>
-                <w:b/>
-                <w:sz w:val="19"/>
-              </w:rPr>
-              <w:t xml:space="preserve">Getting them</w:t>
-            </w:r>
-          </w:p>
-        </w:tc>
-      </w:tr>
-      <w:tr>
-        <w:tc>
-          <w:tcPr/>
-          <w:p>
-            <w:pPr>
-              <w:pStyle w:val="Compact"/>
-              <w:jc w:val="left"/>
-            </w:pPr>
-            <w:r>
-              <w:rPr>
-                <w:b/>
-                <w:sz w:val="19"/>
-              </w:rPr>
-              <w:t xml:space="preserve">I</w:t>
-            </w:r>
-          </w:p>
-        </w:tc>
-        <w:tc>
-          <w:tcPr/>
-          <w:p>
-            <w:pPr>
-              <w:pStyle w:val="Compact"/>
-              <w:jc w:val="left"/>
-            </w:pPr>
-            <w:r>
-              <w:rPr>
-                <w:sz w:val="19"/>
-              </w:rPr>
-              <w:t xml:space="preserve">Common occult supplies: chalk, salt, candles, herbs, incense</w:t>
-            </w:r>
-          </w:p>
-        </w:tc>
-        <w:tc>
-          <w:tcPr/>
-          <w:p>
-            <w:pPr>
-              <w:pStyle w:val="Compact"/>
-              <w:jc w:val="left"/>
-            </w:pPr>
-            <w:r>
-              <w:rPr>
-                <w:sz w:val="19"/>
-              </w:rPr>
-              <w:t xml:space="preserve">A</w:t>
-            </w:r>
-            <w:r>
-              <w:rPr>
-                <w:sz w:val="19"/>
-              </w:rPr>
-              <w:t xml:space="preserve"> </w:t>
-            </w:r>
-            <w:r>
-              <w:rPr>
-                <w:bCs/>
-                <w:b/>
-                <w:sz w:val="19"/>
-              </w:rPr>
-              <w:t xml:space="preserve">ritual kit</w:t>
-            </w:r>
-            <w:r>
-              <w:rPr>
-                <w:sz w:val="19"/>
-              </w:rPr>
-              <w:t xml:space="preserve"> </w:t>
-            </w:r>
-            <w:r>
-              <w:rPr>
-                <w:sz w:val="19"/>
-              </w:rPr>
-              <w:t xml:space="preserve">holds enough for a few workings; restocking takes a day and a shop that knows what you’re asking for</w:t>
-            </w:r>
-          </w:p>
-        </w:tc>
-      </w:tr>
-      <w:tr>
-        <w:tc>
-          <w:tcPr/>
-          <w:p>
-            <w:pPr>
-              <w:pStyle w:val="Compact"/>
-              <w:jc w:val="left"/>
-            </w:pPr>
-            <w:r>
-              <w:rPr>
-                <w:b/>
-                <w:sz w:val="19"/>
-              </w:rPr>
-              <w:t xml:space="preserve">II</w:t>
-            </w:r>
-          </w:p>
-        </w:tc>
-        <w:tc>
-          <w:tcPr/>
-          <w:p>
-            <w:pPr>
-              <w:pStyle w:val="Compact"/>
-              <w:jc w:val="left"/>
-            </w:pPr>
-            <w:r>
-              <w:rPr>
-                <w:sz w:val="19"/>
-              </w:rPr>
-              <w:t xml:space="preserve">Rare components, used up in the working: meteorite iron, relic dust, water from a spring that never freezes</w:t>
-            </w:r>
-          </w:p>
-        </w:tc>
-        <w:tc>
-          <w:tcPr/>
-          <w:p>
-            <w:pPr>
-              <w:pStyle w:val="Compact"/>
-              <w:jc w:val="left"/>
-            </w:pPr>
-            <w:r>
-              <w:rPr>
-                <w:sz w:val="19"/>
-              </w:rPr>
-              <w:t xml:space="preserve">A lead to follow (a dealer, a collector, an Earth Wardens contact, a Morcain fence): usually a roll and a price</w:t>
-            </w:r>
-          </w:p>
-        </w:tc>
-      </w:tr>
-      <w:tr>
-        <w:tc>
-          <w:tcPr/>
-          <w:p>
-            <w:pPr>
-              <w:pStyle w:val="Compact"/>
-              <w:jc w:val="left"/>
-            </w:pPr>
-            <w:r>
-              <w:rPr>
-                <w:b/>
-                <w:sz w:val="19"/>
-              </w:rPr>
-              <w:t xml:space="preserve">III</w:t>
-            </w:r>
-          </w:p>
-        </w:tc>
-        <w:tc>
-          <w:tcPr/>
-          <w:p>
-            <w:pPr>
-              <w:pStyle w:val="Compact"/>
-              <w:jc w:val="left"/>
-            </w:pPr>
-            <w:r>
-              <w:rPr>
-                <w:sz w:val="19"/>
-              </w:rPr>
-              <w:t xml:space="preserve">One of a kind, often guarded, sometimes alive</w:t>
-            </w:r>
-          </w:p>
-        </w:tc>
-        <w:tc>
-          <w:tcPr/>
-          <w:p>
-            <w:pPr>
-              <w:pStyle w:val="Compact"/>
-              <w:jc w:val="left"/>
-            </w:pPr>
-            <w:r>
-              <w:rPr>
-                <w:sz w:val="19"/>
-              </w:rPr>
-              <w:t xml:space="preserve">An adventure of its own</w:t>
-            </w:r>
-          </w:p>
-        </w:tc>
-      </w:tr>
-    </w:tbl>
-    <w:p>
-      <w:pPr>
-        <w:pStyle w:val="BodyText"/>
-      </w:pPr>
-      <w:r>
-        <w:t xml:space="preserve">Missing materials can sometimes be improvised at −2; the GM may rule that a ritual can’t be done without the real thing.</w:t>
-      </w:r>
-    </w:p>
-    <w:p>
-      <w:pPr>
-        <w:pStyle w:val="BodyText"/>
-      </w:pPr>
-      <w:r>
-        <w:rPr>
-          <w:bCs/>
-          <w:b/>
-        </w:rPr>
-        <w:t xml:space="preserve">Fuel.</w:t>
-      </w:r>
-      <w:r>
-        <w:t xml:space="preserve"> </w:t>
-      </w:r>
-      <w:r>
-        <w:t xml:space="preserve">Every ritual must also be fueled. Choose one source:</w:t>
+        <w:t xml:space="preserve">Most powers simply go further at Classes IV to VI. Speed and Flight have set top speeds at every Class, measured in multiples of the speed of sound (Mach 1 is about 760 mph). Player characters reach these Classes only by pushing (one action, one box of Strain); the GM’s characters may have them outright.</w:t>
       </w:r>
     </w:p>
     <w:tbl>
@@ -20378,7 +19971,7 @@
                 <w:b/>
                 <w:sz w:val="19"/>
               </w:rPr>
-              <w:t xml:space="preserve">Fuel</w:t>
+              <w:t xml:space="preserve">Power</w:t>
             </w:r>
           </w:p>
         </w:tc>
@@ -20396,7 +19989,7 @@
                 <w:b/>
                 <w:sz w:val="19"/>
               </w:rPr>
-              <w:t xml:space="preserve">Class I</w:t>
+              <w:t xml:space="preserve">Class IV</w:t>
             </w:r>
           </w:p>
         </w:tc>
@@ -20414,7 +20007,7 @@
                 <w:b/>
                 <w:sz w:val="19"/>
               </w:rPr>
-              <w:t xml:space="preserve">Class II</w:t>
+              <w:t xml:space="preserve">Class V</w:t>
             </w:r>
           </w:p>
         </w:tc>
@@ -20432,6 +20025,658 @@
                 <w:b/>
                 <w:sz w:val="19"/>
               </w:rPr>
+              <w:t xml:space="preserve">Class VI</w:t>
+            </w:r>
+          </w:p>
+        </w:tc>
+      </w:tr>
+      <w:tr>
+        <w:tc>
+          <w:tcPr/>
+          <w:p>
+            <w:pPr>
+              <w:pStyle w:val="Compact"/>
+              <w:jc w:val="left"/>
+            </w:pPr>
+            <w:r>
+              <w:rPr>
+                <w:bCs/>
+                <w:b/>
+                <w:sz w:val="19"/>
+              </w:rPr>
+              <w:t xml:space="preserve">Speed</w:t>
+            </w:r>
+          </w:p>
+        </w:tc>
+        <w:tc>
+          <w:tcPr/>
+          <w:p>
+            <w:pPr>
+              <w:pStyle w:val="Compact"/>
+              <w:jc w:val="left"/>
+            </w:pPr>
+            <w:r>
+              <w:rPr>
+                <w:sz w:val="19"/>
+              </w:rPr>
+              <w:t xml:space="preserve">Mach 3: cross a city in seconds; two actions every round.</w:t>
+            </w:r>
+          </w:p>
+        </w:tc>
+        <w:tc>
+          <w:tcPr/>
+          <w:p>
+            <w:pPr>
+              <w:pStyle w:val="Compact"/>
+              <w:jc w:val="left"/>
+            </w:pPr>
+            <w:r>
+              <w:rPr>
+                <w:sz w:val="19"/>
+              </w:rPr>
+              <w:t xml:space="preserve">Mach 10: cross a continent in minutes; three actions a round.</w:t>
+            </w:r>
+          </w:p>
+        </w:tc>
+        <w:tc>
+          <w:tcPr/>
+          <w:p>
+            <w:pPr>
+              <w:pStyle w:val="Compact"/>
+              <w:jc w:val="left"/>
+            </w:pPr>
+            <w:r>
+              <w:rPr>
+                <w:sz w:val="19"/>
+              </w:rPr>
+              <w:t xml:space="preserve">Mach 25 and beyond: circle the Earth in under two hours; the world all but stands still.</w:t>
+            </w:r>
+          </w:p>
+        </w:tc>
+      </w:tr>
+      <w:tr>
+        <w:tc>
+          <w:tcPr/>
+          <w:p>
+            <w:pPr>
+              <w:pStyle w:val="Compact"/>
+              <w:jc w:val="left"/>
+            </w:pPr>
+            <w:r>
+              <w:rPr>
+                <w:bCs/>
+                <w:b/>
+                <w:sz w:val="19"/>
+              </w:rPr>
+              <w:t xml:space="preserve">Flight</w:t>
+            </w:r>
+          </w:p>
+        </w:tc>
+        <w:tc>
+          <w:tcPr/>
+          <w:p>
+            <w:pPr>
+              <w:pStyle w:val="Compact"/>
+              <w:jc w:val="left"/>
+            </w:pPr>
+            <w:r>
+              <w:rPr>
+                <w:sz w:val="19"/>
+              </w:rPr>
+              <w:t xml:space="preserve">Mach 5: outfly any jet; cross an ocean in an hour or two.</w:t>
+            </w:r>
+          </w:p>
+        </w:tc>
+        <w:tc>
+          <w:tcPr/>
+          <w:p>
+            <w:pPr>
+              <w:pStyle w:val="Compact"/>
+              <w:jc w:val="left"/>
+            </w:pPr>
+            <w:r>
+              <w:rPr>
+                <w:sz w:val="19"/>
+              </w:rPr>
+              <w:t xml:space="preserve">Mach 10: anywhere on Earth within a couple of hours.</w:t>
+            </w:r>
+          </w:p>
+        </w:tc>
+        <w:tc>
+          <w:tcPr/>
+          <w:p>
+            <w:pPr>
+              <w:pStyle w:val="Compact"/>
+              <w:jc w:val="left"/>
+            </w:pPr>
+            <w:r>
+              <w:rPr>
+                <w:sz w:val="19"/>
+              </w:rPr>
+              <w:t xml:space="preserve">Mach 25 and beyond: orbital speed; fly into space (with Adaptation to survive it).</w:t>
+            </w:r>
+          </w:p>
+        </w:tc>
+      </w:tr>
+    </w:tbl>
+    <w:bookmarkEnd w:id="89"/>
+    <w:bookmarkStart w:id="90" w:name="rituals"/>
+    <w:p>
+      <w:pPr>
+        <w:pStyle w:val="Heading2"/>
+      </w:pPr>
+      <w:r>
+        <w:t xml:space="preserve">Rituals</w:t>
+      </w:r>
+    </w:p>
+    <w:p>
+      <w:pPr>
+        <w:pStyle w:val="FirstParagraph"/>
+      </w:pPr>
+      <w:r>
+        <w:t xml:space="preserve">Adepts can</w:t>
+      </w:r>
+      <w:r>
+        <w:t xml:space="preserve"> </w:t>
+      </w:r>
+      <w:r>
+        <w:rPr>
+          <w:bCs/>
+          <w:b/>
+        </w:rPr>
+        <w:t xml:space="preserve">emulate any power by ritual</w:t>
+      </w:r>
+      <w:r>
+        <w:t xml:space="preserve">, at any Class up to their own highest.</w:t>
+      </w:r>
+    </w:p>
+    <w:p>
+      <w:pPr>
+        <w:numPr>
+          <w:ilvl w:val="0"/>
+          <w:numId w:val="1017"/>
+        </w:numPr>
+        <w:pStyle w:val="Compact"/>
+      </w:pPr>
+      <w:r>
+        <w:rPr>
+          <w:bCs/>
+          <w:b/>
+        </w:rPr>
+        <w:t xml:space="preserve">Time:</w:t>
+      </w:r>
+      <w:r>
+        <w:t xml:space="preserve"> </w:t>
+      </w:r>
+      <w:r>
+        <w:t xml:space="preserve">Class I takes ten minutes, Class II an hour, Class III a night. A ritual can’t be done in the middle of a fight.</w:t>
+      </w:r>
+    </w:p>
+    <w:p>
+      <w:pPr>
+        <w:numPr>
+          <w:ilvl w:val="0"/>
+          <w:numId w:val="1017"/>
+        </w:numPr>
+        <w:pStyle w:val="Compact"/>
+      </w:pPr>
+      <w:r>
+        <w:rPr>
+          <w:bCs/>
+          <w:b/>
+        </w:rPr>
+        <w:t xml:space="preserve">The roll:</w:t>
+      </w:r>
+      <w:r>
+        <w:t xml:space="preserve"> </w:t>
+      </w:r>
+      <w:r>
+        <w:t xml:space="preserve">Powers, at −2 for Class II and −4 for Class III.</w:t>
+      </w:r>
+    </w:p>
+    <w:p>
+      <w:pPr>
+        <w:numPr>
+          <w:ilvl w:val="0"/>
+          <w:numId w:val="1017"/>
+        </w:numPr>
+        <w:pStyle w:val="Compact"/>
+      </w:pPr>
+      <w:r>
+        <w:rPr>
+          <w:bCs/>
+          <w:b/>
+        </w:rPr>
+        <w:t xml:space="preserve">Effect:</w:t>
+      </w:r>
+      <w:r>
+        <w:t xml:space="preserve"> </w:t>
+      </w:r>
+      <w:r>
+        <w:t xml:space="preserve">the power works once, or for one scene, as the GM judges, and can be cast on someone else.</w:t>
+      </w:r>
+    </w:p>
+    <w:p>
+      <w:pPr>
+        <w:numPr>
+          <w:ilvl w:val="0"/>
+          <w:numId w:val="1017"/>
+        </w:numPr>
+        <w:pStyle w:val="Compact"/>
+      </w:pPr>
+      <w:r>
+        <w:rPr>
+          <w:bCs/>
+          <w:b/>
+        </w:rPr>
+        <w:t xml:space="preserve">Cost:</w:t>
+      </w:r>
+      <w:r>
+        <w:t xml:space="preserve"> </w:t>
+      </w:r>
+      <w:r>
+        <w:t xml:space="preserve">a failed ritual marks a box of Strain. A natural 18 means something answered that shouldn’t have.</w:t>
+      </w:r>
+    </w:p>
+    <w:p>
+      <w:pPr>
+        <w:numPr>
+          <w:ilvl w:val="0"/>
+          <w:numId w:val="1017"/>
+        </w:numPr>
+        <w:pStyle w:val="Compact"/>
+      </w:pPr>
+      <w:r>
+        <w:t xml:space="preserve">Rituals for (GM) powers still need the GM’s approval.</w:t>
+      </w:r>
+    </w:p>
+    <w:p>
+      <w:pPr>
+        <w:pStyle w:val="FirstParagraph"/>
+      </w:pPr>
+      <w:r>
+        <w:rPr>
+          <w:bCs/>
+          <w:b/>
+        </w:rPr>
+        <w:t xml:space="preserve">Materials.</w:t>
+      </w:r>
+      <w:r>
+        <w:t xml:space="preserve"> </w:t>
+      </w:r>
+      <w:r>
+        <w:t xml:space="preserve">Every ritual needs specialized materials, matched to the power: a hawk’s feather and storm water for Flight, a mirror silvered with mercury for Illusion, grave dirt for Summoning.</w:t>
+      </w:r>
+    </w:p>
+    <w:tbl>
+      <w:tblPr>
+        <w:tblStyle w:val="Table"/>
+        <w:tblW w:type="pct" w:w="5000"/>
+        <w:tblLook w:firstRow="1" w:lastRow="0" w:firstColumn="0" w:lastColumn="0" w:noHBand="0" w:noVBand="0" w:val="0020"/>
+        <w:jc w:val="start"/>
+        <w:tblBorders>
+          <w:top w:val="single" w:sz="4" w:color="B8C2D3"/>
+          <w:left w:val="single" w:sz="4" w:color="B8C2D3"/>
+          <w:bottom w:val="single" w:sz="4" w:color="B8C2D3"/>
+          <w:right w:val="single" w:sz="4" w:color="B8C2D3"/>
+          <w:insideH w:val="single" w:sz="4" w:color="B8C2D3"/>
+          <w:insideV w:val="single" w:sz="4" w:color="B8C2D3"/>
+        </w:tblBorders>
+      </w:tblPr>
+      <w:tblGrid>
+        <w:gridCol w:w="2640"/>
+        <w:gridCol w:w="2640"/>
+        <w:gridCol w:w="2640"/>
+      </w:tblGrid>
+      <w:tr>
+        <w:trPr>
+          <w:tblHeader w:val="true"/>
+        </w:trPr>
+        <w:tc>
+          <w:tcPr>
+            <w:shd w:val="clear" w:fill="E8EEF8"/>
+          </w:tcPr>
+          <w:p>
+            <w:pPr>
+              <w:pStyle w:val="Compact"/>
+              <w:jc w:val="left"/>
+            </w:pPr>
+            <w:r>
+              <w:rPr>
+                <w:b/>
+                <w:sz w:val="19"/>
+              </w:rPr>
+              <w:t xml:space="preserve">Class</w:t>
+            </w:r>
+          </w:p>
+        </w:tc>
+        <w:tc>
+          <w:tcPr>
+            <w:shd w:val="clear" w:fill="E8EEF8"/>
+          </w:tcPr>
+          <w:p>
+            <w:pPr>
+              <w:pStyle w:val="Compact"/>
+              <w:jc w:val="left"/>
+            </w:pPr>
+            <w:r>
+              <w:rPr>
+                <w:b/>
+                <w:sz w:val="19"/>
+              </w:rPr>
+              <w:t xml:space="preserve">Materials</w:t>
+            </w:r>
+          </w:p>
+        </w:tc>
+        <w:tc>
+          <w:tcPr>
+            <w:shd w:val="clear" w:fill="E8EEF8"/>
+          </w:tcPr>
+          <w:p>
+            <w:pPr>
+              <w:pStyle w:val="Compact"/>
+              <w:jc w:val="left"/>
+            </w:pPr>
+            <w:r>
+              <w:rPr>
+                <w:b/>
+                <w:sz w:val="19"/>
+              </w:rPr>
+              <w:t xml:space="preserve">Getting them</w:t>
+            </w:r>
+          </w:p>
+        </w:tc>
+      </w:tr>
+      <w:tr>
+        <w:tc>
+          <w:tcPr/>
+          <w:p>
+            <w:pPr>
+              <w:pStyle w:val="Compact"/>
+              <w:jc w:val="left"/>
+            </w:pPr>
+            <w:r>
+              <w:rPr>
+                <w:b/>
+                <w:sz w:val="19"/>
+              </w:rPr>
+              <w:t xml:space="preserve">I</w:t>
+            </w:r>
+          </w:p>
+        </w:tc>
+        <w:tc>
+          <w:tcPr/>
+          <w:p>
+            <w:pPr>
+              <w:pStyle w:val="Compact"/>
+              <w:jc w:val="left"/>
+            </w:pPr>
+            <w:r>
+              <w:rPr>
+                <w:sz w:val="19"/>
+              </w:rPr>
+              <w:t xml:space="preserve">Common occult supplies: chalk, salt, candles, herbs, incense</w:t>
+            </w:r>
+          </w:p>
+        </w:tc>
+        <w:tc>
+          <w:tcPr/>
+          <w:p>
+            <w:pPr>
+              <w:pStyle w:val="Compact"/>
+              <w:jc w:val="left"/>
+            </w:pPr>
+            <w:r>
+              <w:rPr>
+                <w:sz w:val="19"/>
+              </w:rPr>
+              <w:t xml:space="preserve">A</w:t>
+            </w:r>
+            <w:r>
+              <w:rPr>
+                <w:sz w:val="19"/>
+              </w:rPr>
+              <w:t xml:space="preserve"> </w:t>
+            </w:r>
+            <w:r>
+              <w:rPr>
+                <w:bCs/>
+                <w:b/>
+                <w:sz w:val="19"/>
+              </w:rPr>
+              <w:t xml:space="preserve">ritual kit</w:t>
+            </w:r>
+            <w:r>
+              <w:rPr>
+                <w:sz w:val="19"/>
+              </w:rPr>
+              <w:t xml:space="preserve"> </w:t>
+            </w:r>
+            <w:r>
+              <w:rPr>
+                <w:sz w:val="19"/>
+              </w:rPr>
+              <w:t xml:space="preserve">holds enough for a few workings; restocking takes a day and a shop that knows what you’re asking for</w:t>
+            </w:r>
+          </w:p>
+        </w:tc>
+      </w:tr>
+      <w:tr>
+        <w:tc>
+          <w:tcPr/>
+          <w:p>
+            <w:pPr>
+              <w:pStyle w:val="Compact"/>
+              <w:jc w:val="left"/>
+            </w:pPr>
+            <w:r>
+              <w:rPr>
+                <w:b/>
+                <w:sz w:val="19"/>
+              </w:rPr>
+              <w:t xml:space="preserve">II</w:t>
+            </w:r>
+          </w:p>
+        </w:tc>
+        <w:tc>
+          <w:tcPr/>
+          <w:p>
+            <w:pPr>
+              <w:pStyle w:val="Compact"/>
+              <w:jc w:val="left"/>
+            </w:pPr>
+            <w:r>
+              <w:rPr>
+                <w:sz w:val="19"/>
+              </w:rPr>
+              <w:t xml:space="preserve">Rare components, used up in the working: meteorite iron, relic dust, water from a spring that never freezes</w:t>
+            </w:r>
+          </w:p>
+        </w:tc>
+        <w:tc>
+          <w:tcPr/>
+          <w:p>
+            <w:pPr>
+              <w:pStyle w:val="Compact"/>
+              <w:jc w:val="left"/>
+            </w:pPr>
+            <w:r>
+              <w:rPr>
+                <w:sz w:val="19"/>
+              </w:rPr>
+              <w:t xml:space="preserve">A lead to follow (a dealer, a collector, an Earth Wardens contact, a Morcain fence): usually a roll and a price</w:t>
+            </w:r>
+          </w:p>
+        </w:tc>
+      </w:tr>
+      <w:tr>
+        <w:tc>
+          <w:tcPr/>
+          <w:p>
+            <w:pPr>
+              <w:pStyle w:val="Compact"/>
+              <w:jc w:val="left"/>
+            </w:pPr>
+            <w:r>
+              <w:rPr>
+                <w:b/>
+                <w:sz w:val="19"/>
+              </w:rPr>
+              <w:t xml:space="preserve">III</w:t>
+            </w:r>
+          </w:p>
+        </w:tc>
+        <w:tc>
+          <w:tcPr/>
+          <w:p>
+            <w:pPr>
+              <w:pStyle w:val="Compact"/>
+              <w:jc w:val="left"/>
+            </w:pPr>
+            <w:r>
+              <w:rPr>
+                <w:sz w:val="19"/>
+              </w:rPr>
+              <w:t xml:space="preserve">One of a kind, often guarded, sometimes alive</w:t>
+            </w:r>
+          </w:p>
+        </w:tc>
+        <w:tc>
+          <w:tcPr/>
+          <w:p>
+            <w:pPr>
+              <w:pStyle w:val="Compact"/>
+              <w:jc w:val="left"/>
+            </w:pPr>
+            <w:r>
+              <w:rPr>
+                <w:sz w:val="19"/>
+              </w:rPr>
+              <w:t xml:space="preserve">An adventure of its own</w:t>
+            </w:r>
+          </w:p>
+        </w:tc>
+      </w:tr>
+    </w:tbl>
+    <w:p>
+      <w:pPr>
+        <w:pStyle w:val="BodyText"/>
+      </w:pPr>
+      <w:r>
+        <w:t xml:space="preserve">Missing materials can sometimes be improvised at −2; the GM may rule that a ritual can’t be done without the real thing.</w:t>
+      </w:r>
+    </w:p>
+    <w:p>
+      <w:pPr>
+        <w:pStyle w:val="BodyText"/>
+      </w:pPr>
+      <w:r>
+        <w:rPr>
+          <w:bCs/>
+          <w:b/>
+        </w:rPr>
+        <w:t xml:space="preserve">Fuel.</w:t>
+      </w:r>
+      <w:r>
+        <w:t xml:space="preserve"> </w:t>
+      </w:r>
+      <w:r>
+        <w:t xml:space="preserve">Every ritual must also be fueled. Choose one source:</w:t>
+      </w:r>
+    </w:p>
+    <w:tbl>
+      <w:tblPr>
+        <w:tblStyle w:val="Table"/>
+        <w:tblW w:type="pct" w:w="5000"/>
+        <w:tblLook w:firstRow="1" w:lastRow="0" w:firstColumn="0" w:lastColumn="0" w:noHBand="0" w:noVBand="0" w:val="0020"/>
+        <w:jc w:val="start"/>
+        <w:tblBorders>
+          <w:top w:val="single" w:sz="4" w:color="B8C2D3"/>
+          <w:left w:val="single" w:sz="4" w:color="B8C2D3"/>
+          <w:bottom w:val="single" w:sz="4" w:color="B8C2D3"/>
+          <w:right w:val="single" w:sz="4" w:color="B8C2D3"/>
+          <w:insideH w:val="single" w:sz="4" w:color="B8C2D3"/>
+          <w:insideV w:val="single" w:sz="4" w:color="B8C2D3"/>
+        </w:tblBorders>
+      </w:tblPr>
+      <w:tblGrid>
+        <w:gridCol w:w="1980"/>
+        <w:gridCol w:w="1980"/>
+        <w:gridCol w:w="1980"/>
+        <w:gridCol w:w="1980"/>
+      </w:tblGrid>
+      <w:tr>
+        <w:trPr>
+          <w:tblHeader w:val="true"/>
+        </w:trPr>
+        <w:tc>
+          <w:tcPr>
+            <w:shd w:val="clear" w:fill="E8EEF8"/>
+          </w:tcPr>
+          <w:p>
+            <w:pPr>
+              <w:pStyle w:val="Compact"/>
+              <w:jc w:val="left"/>
+            </w:pPr>
+            <w:r>
+              <w:rPr>
+                <w:b/>
+                <w:sz w:val="19"/>
+              </w:rPr>
+              <w:t xml:space="preserve">Fuel</w:t>
+            </w:r>
+          </w:p>
+        </w:tc>
+        <w:tc>
+          <w:tcPr>
+            <w:shd w:val="clear" w:fill="E8EEF8"/>
+          </w:tcPr>
+          <w:p>
+            <w:pPr>
+              <w:pStyle w:val="Compact"/>
+              <w:jc w:val="left"/>
+            </w:pPr>
+            <w:r>
+              <w:rPr>
+                <w:b/>
+                <w:sz w:val="19"/>
+              </w:rPr>
+              <w:t xml:space="preserve">Class I</w:t>
+            </w:r>
+          </w:p>
+        </w:tc>
+        <w:tc>
+          <w:tcPr>
+            <w:shd w:val="clear" w:fill="E8EEF8"/>
+          </w:tcPr>
+          <w:p>
+            <w:pPr>
+              <w:pStyle w:val="Compact"/>
+              <w:jc w:val="left"/>
+            </w:pPr>
+            <w:r>
+              <w:rPr>
+                <w:b/>
+                <w:sz w:val="19"/>
+              </w:rPr>
+              <w:t xml:space="preserve">Class II</w:t>
+            </w:r>
+          </w:p>
+        </w:tc>
+        <w:tc>
+          <w:tcPr>
+            <w:shd w:val="clear" w:fill="E8EEF8"/>
+          </w:tcPr>
+          <w:p>
+            <w:pPr>
+              <w:pStyle w:val="Compact"/>
+              <w:jc w:val="left"/>
+            </w:pPr>
+            <w:r>
+              <w:rPr>
+                <w:b/>
+                <w:sz w:val="19"/>
+              </w:rPr>
               <w:t xml:space="preserve">Class III</w:t>
             </w:r>
           </w:p>
@@ -20824,8 +21069,8 @@
         <w:t xml:space="preserve">Without fuel, a ritual fails before it begins. Fuel taken from an unwilling person works, and is exactly how the Foundation and Raster Zero do it; for player characters it’s a crime under the EPA, and a black mark on any Adept.</w:t>
       </w:r>
     </w:p>
-    <w:bookmarkEnd w:id="89"/>
-    <w:bookmarkStart w:id="90" w:name="aegis-suits"/>
+    <w:bookmarkEnd w:id="90"/>
+    <w:bookmarkStart w:id="91" w:name="aegis-suits"/>
     <w:p>
       <w:pPr>
         <w:pStyle w:val="Heading2"/>
@@ -20903,8 +21148,8 @@
         <w:t xml:space="preserve">fired with Firearms. Suiting up takes a minute. A shot at the power pack (−2 to aim) that gets through shuts the suit down until it’s repaired with Engineering. The suits belong to ExLAW, or to whoever stole one.</w:t>
       </w:r>
     </w:p>
-    <w:bookmarkEnd w:id="90"/>
-    <w:bookmarkStart w:id="91" w:name="the-labs-want-you"/>
+    <w:bookmarkEnd w:id="91"/>
+    <w:bookmarkStart w:id="92" w:name="the-labs-want-you"/>
     <w:p>
       <w:pPr>
         <w:pStyle w:val="Heading2"/>
@@ -20921,9 +21166,9 @@
         <w:t xml:space="preserve">A character with a Class III power, or any (GM) power, draws interest from the Foundation and Raster Zero. That interest is a story hook, not a rule.</w:t>
       </w:r>
     </w:p>
-    <w:bookmarkEnd w:id="91"/>
     <w:bookmarkEnd w:id="92"/>
-    <w:bookmarkStart w:id="93" w:name="factions"/>
+    <w:bookmarkEnd w:id="93"/>
+    <w:bookmarkStart w:id="94" w:name="factions"/>
     <w:p>
       <w:pPr>
         <w:pStyle w:val="Heading1"/>
@@ -21375,8 +21620,8 @@
         <w:t xml:space="preserve">The dark reflection of our world, sending duplicates through the thinning walls.</w:t>
       </w:r>
     </w:p>
-    <w:bookmarkEnd w:id="93"/>
-    <w:bookmarkStart w:id="94" w:name="otherworld-and-shadow-earth"/>
+    <w:bookmarkEnd w:id="94"/>
+    <w:bookmarkStart w:id="95" w:name="otherworld-and-shadow-earth"/>
     <w:p>
       <w:pPr>
         <w:pStyle w:val="Heading1"/>
@@ -21553,8 +21798,8 @@
         <w:t xml:space="preserve">of our own people, who serve as the rulers’ minions. Since 2012 the walls have been thin, and more of them get through every year.</w:t>
       </w:r>
     </w:p>
-    <w:bookmarkEnd w:id="94"/>
-    <w:bookmarkStart w:id="95" w:name="notable-operants"/>
+    <w:bookmarkEnd w:id="95"/>
+    <w:bookmarkStart w:id="96" w:name="notable-operants"/>
     <w:p>
       <w:pPr>
         <w:pStyle w:val="Heading1"/>
@@ -22124,8 +22369,8 @@
         <w:t xml:space="preserve">Once an adjunct professor of comparative folklore in New York, obsessed with a single current of power he believed older than civilization. In a university archive he found untranslated manuscripts in a 19th-century occultist’s papers: a ritual encoded in language itself. He spoke the words aloud, and his mind opened for a few burning moments to the raw currents of Otherworld. It shattered him. He lost his job and his name, and wanders New York’s alleys and subway tunnels muttering. Yet his chalk sigils ward whole stations by accident, his ramblings predict murders and market crashes, pigeons land on his shoulders as if awaiting orders, and children sometimes see a crown of burning letters over his head. He is part prophet, part lunatic, part guardian and part danger.</w:t>
       </w:r>
     </w:p>
-    <w:bookmarkEnd w:id="95"/>
-    <w:bookmarkStart w:id="96" w:name="threats"/>
+    <w:bookmarkEnd w:id="96"/>
+    <w:bookmarkStart w:id="97" w:name="threats"/>
     <w:p>
       <w:pPr>
         <w:pStyle w:val="Heading1"/>
@@ -24363,8 +24608,8 @@
         <w:t xml:space="preserve">For a tougher version, add +1 to its targets and one box, or raise a power one Class; for a weaker one, subtract.</w:t>
       </w:r>
     </w:p>
-    <w:bookmarkEnd w:id="96"/>
-    <w:bookmarkStart w:id="104" w:name="ready-made-characters"/>
+    <w:bookmarkEnd w:id="97"/>
+    <w:bookmarkStart w:id="105" w:name="ready-made-characters"/>
     <w:p>
       <w:pPr>
         <w:pStyle w:val="Heading1"/>
@@ -24381,7 +24626,7 @@
         <w:t xml:space="preserve">Characters ready to play, for one-shots, new players, or a group in a hurry. Each follows the creation rules exactly, and their connections tie them together. In the creator, choose one from the ready-made list to open it and make it your own.</w:t>
       </w:r>
     </w:p>
-    <w:bookmarkStart w:id="97" w:name="rachel-kwan"/>
+    <w:bookmarkStart w:id="98" w:name="rachel-kwan"/>
     <w:p>
       <w:pPr>
         <w:pStyle w:val="Heading2"/>
@@ -24610,8 +24855,8 @@
         <w:t xml:space="preserve">Jess Calloway is the only reporter who asked about her missing partner. Kwan hasn’t decided whether to trust her.</w:t>
       </w:r>
     </w:p>
-    <w:bookmarkEnd w:id="97"/>
-    <w:bookmarkStart w:id="98" w:name="luis-bulldog-ortega"/>
+    <w:bookmarkEnd w:id="98"/>
+    <w:bookmarkStart w:id="99" w:name="luis-bulldog-ortega"/>
     <w:p>
       <w:pPr>
         <w:pStyle w:val="Heading2"/>
@@ -24836,8 +25081,8 @@
         <w:t xml:space="preserve">He flew cover for Rachel Kwan the night her partner vanished, and saw something he never put in the report.</w:t>
       </w:r>
     </w:p>
-    <w:bookmarkEnd w:id="98"/>
-    <w:bookmarkStart w:id="99" w:name="naomi-price"/>
+    <w:bookmarkEnd w:id="99"/>
+    <w:bookmarkStart w:id="100" w:name="naomi-price"/>
     <w:p>
       <w:pPr>
         <w:pStyle w:val="Heading2"/>
@@ -25044,8 +25289,8 @@
         <w:t xml:space="preserve">Static saved her from a Foundation snatch team on live TV, and vanished before the cameras turned.</w:t>
       </w:r>
     </w:p>
-    <w:bookmarkEnd w:id="99"/>
-    <w:bookmarkStart w:id="100" w:name="dr.-tobias-wren"/>
+    <w:bookmarkEnd w:id="100"/>
+    <w:bookmarkStart w:id="101" w:name="dr.-tobias-wren"/>
     <w:p>
       <w:pPr>
         <w:pStyle w:val="Heading2"/>
@@ -25274,8 +25519,8 @@
         <w:t xml:space="preserve">He taught Maeve Ashgrove’s handler, and was the one who recognized what Maeve really is.</w:t>
       </w:r>
     </w:p>
-    <w:bookmarkEnd w:id="100"/>
-    <w:bookmarkStart w:id="101" w:name="jess-calloway"/>
+    <w:bookmarkEnd w:id="101"/>
+    <w:bookmarkStart w:id="102" w:name="jess-calloway"/>
     <w:p>
       <w:pPr>
         <w:pStyle w:val="Heading2"/>
@@ -25504,8 +25749,8 @@
         <w:t xml:space="preserve">Rachel Kwan’s missing partner was her source. She hasn’t told Kwan yet.</w:t>
       </w:r>
     </w:p>
-    <w:bookmarkEnd w:id="101"/>
-    <w:bookmarkStart w:id="102" w:name="subject-19"/>
+    <w:bookmarkEnd w:id="102"/>
+    <w:bookmarkStart w:id="103" w:name="subject-19"/>
     <w:p>
       <w:pPr>
         <w:pStyle w:val="Heading2"/>
@@ -25755,8 +26000,8 @@
         <w:t xml:space="preserve">Saved Daybreak from a Foundation snatch team on live TV, and ran before the cameras turned.</w:t>
       </w:r>
     </w:p>
-    <w:bookmarkEnd w:id="102"/>
-    <w:bookmarkStart w:id="103" w:name="maeve-ashgrove"/>
+    <w:bookmarkEnd w:id="103"/>
+    <w:bookmarkStart w:id="104" w:name="maeve-ashgrove"/>
     <w:p>
       <w:pPr>
         <w:pStyle w:val="Heading2"/>
@@ -25985,9 +26230,9 @@
         <w:t xml:space="preserve">Dr. Tobias Wren saw through her glamour the first day. He’s kept her secret; she wonders what it’ll cost.</w:t>
       </w:r>
     </w:p>
-    <w:bookmarkEnd w:id="103"/>
     <w:bookmarkEnd w:id="104"/>
-    <w:bookmarkStart w:id="105" w:name="advantages"/>
+    <w:bookmarkEnd w:id="105"/>
+    <w:bookmarkStart w:id="106" w:name="advantages"/>
     <w:p>
       <w:pPr>
         <w:pStyle w:val="Heading1"/>
@@ -26841,8 +27086,8 @@
         <w:t xml:space="preserve">complication unless the GM agrees otherwise. Origin advantages (in each origin’s entry) are often the most flavorful choice for an Operant.</w:t>
       </w:r>
     </w:p>
-    <w:bookmarkEnd w:id="105"/>
-    <w:bookmarkStart w:id="116" w:name="origins"/>
+    <w:bookmarkEnd w:id="106"/>
+    <w:bookmarkStart w:id="117" w:name="origins"/>
     <w:p>
       <w:pPr>
         <w:pStyle w:val="Heading1"/>
@@ -27580,7 +27825,7 @@
         </w:tc>
       </w:tr>
     </w:tbl>
-    <w:bookmarkStart w:id="106" w:name="non-operant"/>
+    <w:bookmarkStart w:id="107" w:name="non-operant"/>
     <w:p>
       <w:pPr>
         <w:pStyle w:val="Heading2"/>
@@ -27929,8 +28174,8 @@
         </w:tc>
       </w:tr>
     </w:tbl>
-    <w:bookmarkEnd w:id="106"/>
-    <w:bookmarkStart w:id="107" w:name="adept"/>
+    <w:bookmarkEnd w:id="107"/>
+    <w:bookmarkStart w:id="108" w:name="adept"/>
     <w:p>
       <w:pPr>
         <w:pStyle w:val="Heading2"/>
@@ -28291,8 +28536,8 @@
         </w:tc>
       </w:tr>
     </w:tbl>
-    <w:bookmarkEnd w:id="107"/>
-    <w:bookmarkStart w:id="108" w:name="aurora-born"/>
+    <w:bookmarkEnd w:id="108"/>
+    <w:bookmarkStart w:id="109" w:name="aurora-born"/>
     <w:p>
       <w:pPr>
         <w:pStyle w:val="Heading2"/>
@@ -28641,8 +28886,8 @@
         </w:tc>
       </w:tr>
     </w:tbl>
-    <w:bookmarkEnd w:id="108"/>
-    <w:bookmarkStart w:id="109" w:name="bonded"/>
+    <w:bookmarkEnd w:id="109"/>
+    <w:bookmarkStart w:id="110" w:name="bonded"/>
     <w:p>
       <w:pPr>
         <w:pStyle w:val="Heading2"/>
@@ -29003,8 +29248,8 @@
         </w:tc>
       </w:tr>
     </w:tbl>
-    <w:bookmarkEnd w:id="109"/>
-    <w:bookmarkStart w:id="110" w:name="lab-made"/>
+    <w:bookmarkEnd w:id="110"/>
+    <w:bookmarkStart w:id="111" w:name="lab-made"/>
     <w:p>
       <w:pPr>
         <w:pStyle w:val="Heading2"/>
@@ -29353,8 +29598,8 @@
         </w:tc>
       </w:tr>
     </w:tbl>
-    <w:bookmarkEnd w:id="110"/>
-    <w:bookmarkStart w:id="111" w:name="otherworlder"/>
+    <w:bookmarkEnd w:id="111"/>
+    <w:bookmarkStart w:id="112" w:name="otherworlder"/>
     <w:p>
       <w:pPr>
         <w:pStyle w:val="Heading2"/>
@@ -29703,8 +29948,8 @@
         </w:tc>
       </w:tr>
     </w:tbl>
-    <w:bookmarkEnd w:id="111"/>
-    <w:bookmarkStart w:id="112" w:name="shadow-earth-defector"/>
+    <w:bookmarkEnd w:id="112"/>
+    <w:bookmarkStart w:id="113" w:name="shadow-earth-defector"/>
     <w:p>
       <w:pPr>
         <w:pStyle w:val="Heading2"/>
@@ -30065,8 +30310,8 @@
         </w:tc>
       </w:tr>
     </w:tbl>
-    <w:bookmarkEnd w:id="112"/>
-    <w:bookmarkStart w:id="113" w:name="touched"/>
+    <w:bookmarkEnd w:id="113"/>
+    <w:bookmarkStart w:id="114" w:name="touched"/>
     <w:p>
       <w:pPr>
         <w:pStyle w:val="Heading2"/>
@@ -30430,8 +30675,8 @@
         </w:tc>
       </w:tr>
     </w:tbl>
-    <w:bookmarkEnd w:id="113"/>
-    <w:bookmarkStart w:id="114" w:name="ambrosia"/>
+    <w:bookmarkEnd w:id="114"/>
+    <w:bookmarkStart w:id="115" w:name="ambrosia"/>
     <w:p>
       <w:pPr>
         <w:pStyle w:val="Heading2"/>
@@ -30792,8 +31037,8 @@
         </w:tc>
       </w:tr>
     </w:tbl>
-    <w:bookmarkEnd w:id="114"/>
-    <w:bookmarkStart w:id="115" w:name="mythic"/>
+    <w:bookmarkEnd w:id="115"/>
+    <w:bookmarkStart w:id="116" w:name="mythic"/>
     <w:p>
       <w:pPr>
         <w:pStyle w:val="Heading2"/>
@@ -31154,9 +31399,9 @@
         </w:tc>
       </w:tr>
     </w:tbl>
-    <w:bookmarkEnd w:id="115"/>
     <w:bookmarkEnd w:id="116"/>
-    <w:bookmarkStart w:id="127" w:name="making-your-own"/>
+    <w:bookmarkEnd w:id="117"/>
+    <w:bookmarkStart w:id="128" w:name="making-your-own"/>
     <w:p>
       <w:pPr>
         <w:pStyle w:val="Heading1"/>
@@ -31189,7 +31434,7 @@
         <w:t xml:space="preserve">option at the end of each list, and its checklist holds a custom choice to the same rules as everything else.</w:t>
       </w:r>
     </w:p>
-    <w:bookmarkStart w:id="117" w:name="a-custom-calling"/>
+    <w:bookmarkStart w:id="118" w:name="a-custom-calling"/>
     <w:p>
       <w:pPr>
         <w:pStyle w:val="Heading2"/>
@@ -31365,8 +31610,8 @@
         <w:t xml:space="preserve">.</w:t>
       </w:r>
     </w:p>
-    <w:bookmarkEnd w:id="117"/>
-    <w:bookmarkStart w:id="126" w:name="a-custom-origin"/>
+    <w:bookmarkEnd w:id="118"/>
+    <w:bookmarkStart w:id="127" w:name="a-custom-origin"/>
     <w:p>
       <w:pPr>
         <w:pStyle w:val="Heading2"/>
@@ -31383,7 +31628,7 @@
         <w:t xml:space="preserve">Build it with the GM, one step at a time.</w:t>
       </w:r>
     </w:p>
-    <w:bookmarkStart w:id="118" w:name="the-concept"/>
+    <w:bookmarkStart w:id="119" w:name="the-concept"/>
     <w:p>
       <w:pPr>
         <w:pStyle w:val="Heading3"/>
@@ -31400,8 +31645,8 @@
         <w:t xml:space="preserve">Two or three sentences: where they come from, what sets them apart, and how others see them. It should be something the origins in this book don’t already cover.</w:t>
       </w:r>
     </w:p>
-    <w:bookmarkEnd w:id="118"/>
-    <w:bookmarkStart w:id="119" w:name="the-tier"/>
+    <w:bookmarkEnd w:id="119"/>
+    <w:bookmarkStart w:id="120" w:name="the-tier"/>
     <w:p>
       <w:pPr>
         <w:pStyle w:val="Heading3"/>
@@ -31698,8 +31943,8 @@
         <w:t xml:space="preserve">When in doubt, choose the higher tier.</w:t>
       </w:r>
     </w:p>
-    <w:bookmarkEnd w:id="119"/>
-    <w:bookmarkStart w:id="120" w:name="attribute-adjustments"/>
+    <w:bookmarkEnd w:id="120"/>
+    <w:bookmarkStart w:id="121" w:name="attribute-adjustments"/>
     <w:p>
       <w:pPr>
         <w:pStyle w:val="Heading3"/>
@@ -31745,8 +31990,8 @@
         <w:t xml:space="preserve">: a +2 needs a −2 or two −1s. The adjustments move the attribute’s base (+1 starts it at 11) and raise its starting maximum (13 plus the bonus). Most origins change two to four attributes.</w:t>
       </w:r>
     </w:p>
-    <w:bookmarkEnd w:id="120"/>
-    <w:bookmarkStart w:id="121" w:name="core-rules-tier-1-and-up"/>
+    <w:bookmarkEnd w:id="121"/>
+    <w:bookmarkStart w:id="122" w:name="core-rules-tier-1-and-up"/>
     <w:p>
       <w:pPr>
         <w:pStyle w:val="Heading3"/>
@@ -31763,8 +32008,8 @@
         <w:t xml:space="preserve">One to three short rules that always apply: what they can do (see in the dark, resist cold, a free Trained skill) and what it costs (a weakness, a people’s distrust, a hazard they can’t abide). A strength with no drawback is worth more than it looks, so price it a tier higher.</w:t>
       </w:r>
     </w:p>
-    <w:bookmarkEnd w:id="121"/>
-    <w:bookmarkStart w:id="122" w:name="origin-advantages"/>
+    <w:bookmarkEnd w:id="122"/>
+    <w:bookmarkStart w:id="123" w:name="origin-advantages"/>
     <w:p>
       <w:pPr>
         <w:pStyle w:val="Heading3"/>
@@ -31819,8 +32064,8 @@
         <w:t xml:space="preserve">: a problem the trait causes, with a clear trigger and a real consequence, which earns a Spark point when it bites, like any complication. A character takes one advantage, general or origin, so make them distinct choices.</w:t>
       </w:r>
     </w:p>
-    <w:bookmarkEnd w:id="122"/>
-    <w:bookmarkStart w:id="123" w:name="an-alternate-form-optional-tier-2-or-3"/>
+    <w:bookmarkEnd w:id="123"/>
+    <w:bookmarkStart w:id="124" w:name="an-alternate-form-optional-tier-2-or-3"/>
     <w:p>
       <w:pPr>
         <w:pStyle w:val="Heading3"/>
@@ -31853,8 +32098,8 @@
         <w:t xml:space="preserve">apply.</w:t>
       </w:r>
     </w:p>
-    <w:bookmarkEnd w:id="123"/>
-    <w:bookmarkStart w:id="124" w:name="in-the-creator"/>
+    <w:bookmarkEnd w:id="124"/>
+    <w:bookmarkStart w:id="125" w:name="in-the-creator"/>
     <w:p>
       <w:pPr>
         <w:pStyle w:val="Heading3"/>
@@ -31959,8 +32204,8 @@
         <w:t xml:space="preserve">and enter the advantage and its companion complication.</w:t>
       </w:r>
     </w:p>
-    <w:bookmarkEnd w:id="124"/>
-    <w:bookmarkStart w:id="125" w:name="example"/>
+    <w:bookmarkEnd w:id="125"/>
+    <w:bookmarkStart w:id="126" w:name="example"/>
     <w:p>
       <w:pPr>
         <w:pStyle w:val="Heading3"/>
@@ -32081,10 +32326,10 @@
         <w:t xml:space="preserve">one at Class II, two at Class I.</w:t>
       </w:r>
     </w:p>
-    <w:bookmarkEnd w:id="125"/>
     <w:bookmarkEnd w:id="126"/>
     <w:bookmarkEnd w:id="127"/>
-    <w:bookmarkStart w:id="128" w:name="complications"/>
+    <w:bookmarkEnd w:id="128"/>
+    <w:bookmarkStart w:id="129" w:name="complications"/>
     <w:p>
       <w:pPr>
         <w:pStyle w:val="Heading1"/>
@@ -32789,8 +33034,8 @@
         </w:tc>
       </w:tr>
     </w:tbl>
-    <w:bookmarkEnd w:id="128"/>
-    <w:bookmarkStart w:id="130" w:name="quick-reference"/>
+    <w:bookmarkEnd w:id="129"/>
+    <w:bookmarkStart w:id="131" w:name="quick-reference"/>
     <w:p>
       <w:pPr>
         <w:pStyle w:val="Heading1"/>
@@ -32981,7 +33226,7 @@
       <w:r>
         <w:t xml:space="preserve"> </w:t>
       </w:r>
-      <w:hyperlink r:id="rId129">
+      <w:hyperlink r:id="rId130">
         <w:r>
           <w:rPr>
             <w:rStyle w:val="Hyperlink"/>
@@ -32993,7 +33238,7 @@
         <w:t xml:space="preserve">. You may share, adapt, and use it for any purpose, including commercially, as long as you give appropriate credit to the author.</w:t>
       </w:r>
     </w:p>
-    <w:bookmarkEnd w:id="130"/>
+    <w:bookmarkEnd w:id="131"/>
     <w:sectPr/>
   </w:body>
 </w:document>

</xml_diff>

<commit_message>
ExLAW: powers grow in play (raise a Class, learn new powers, Class IV milestone, Class V capstone)
Co-Authored-By: Claude Opus 5.5 <noreply@anthropic.com>
Claude-Session: https://claude.ai/code/session_015SADCFzhKijkC2foUmXrpC
</commit_message>
<xml_diff>
--- a/legend-dynamics/exlaw/ExLAW_Players_Guide.docx
+++ b/legend-dynamics/exlaw/ExLAW_Players_Guide.docx
@@ -15349,7 +15349,7 @@
     </w:p>
     <w:bookmarkEnd w:id="80"/>
     <w:bookmarkEnd w:id="81"/>
-    <w:bookmarkStart w:id="93" w:name="powers"/>
+    <w:bookmarkStart w:id="94" w:name="powers"/>
     <w:p>
       <w:pPr>
         <w:pStyle w:val="Heading1"/>
@@ -16073,17 +16073,288 @@
       </w:r>
     </w:p>
     <w:bookmarkEnd w:id="83"/>
-    <w:bookmarkStart w:id="84" w:name="the-powers"/>
+    <w:bookmarkStart w:id="84" w:name="growing-your-powers"/>
     <w:p>
       <w:pPr>
         <w:pStyle w:val="Heading2"/>
       </w:pPr>
       <w:r>
+        <w:t xml:space="preserve">Growing your powers</w:t>
+      </w:r>
+    </w:p>
+    <w:p>
+      <w:pPr>
+        <w:pStyle w:val="FirstParagraph"/>
+      </w:pPr>
+      <w:r>
+        <w:t xml:space="preserve">After a significant case, the GM may allow one of these</w:t>
+      </w:r>
+      <w:r>
+        <w:t xml:space="preserve"> </w:t>
+      </w:r>
+      <w:r>
+        <w:rPr>
+          <w:bCs/>
+          <w:b/>
+        </w:rPr>
+        <w:t xml:space="preserve">instead of a skill step</w:t>
+      </w:r>
+      <w:r>
+        <w:t xml:space="preserve">:</w:t>
+      </w:r>
+    </w:p>
+    <w:tbl>
+      <w:tblPr>
+        <w:tblStyle w:val="Table"/>
+        <w:tblW w:type="pct" w:w="5000"/>
+        <w:tblLook w:firstRow="1" w:lastRow="0" w:firstColumn="0" w:lastColumn="0" w:noHBand="0" w:noVBand="0" w:val="0020"/>
+        <w:jc w:val="start"/>
+        <w:tblBorders>
+          <w:top w:val="single" w:sz="4" w:color="B8C2D3"/>
+          <w:left w:val="single" w:sz="4" w:color="B8C2D3"/>
+          <w:bottom w:val="single" w:sz="4" w:color="B8C2D3"/>
+          <w:right w:val="single" w:sz="4" w:color="B8C2D3"/>
+          <w:insideH w:val="single" w:sz="4" w:color="B8C2D3"/>
+          <w:insideV w:val="single" w:sz="4" w:color="B8C2D3"/>
+        </w:tblBorders>
+      </w:tblPr>
+      <w:tblGrid>
+        <w:gridCol w:w="3960"/>
+        <w:gridCol w:w="3960"/>
+      </w:tblGrid>
+      <w:tr>
+        <w:trPr>
+          <w:tblHeader w:val="true"/>
+        </w:trPr>
+        <w:tc>
+          <w:tcPr>
+            <w:shd w:val="clear" w:fill="E8EEF8"/>
+          </w:tcPr>
+          <w:p>
+            <w:pPr>
+              <w:pStyle w:val="Compact"/>
+              <w:jc w:val="left"/>
+            </w:pPr>
+            <w:r>
+              <w:rPr>
+                <w:b/>
+                <w:sz w:val="19"/>
+              </w:rPr>
+              <w:t xml:space="preserve">Advancement</w:t>
+            </w:r>
+          </w:p>
+        </w:tc>
+        <w:tc>
+          <w:tcPr>
+            <w:shd w:val="clear" w:fill="E8EEF8"/>
+          </w:tcPr>
+          <w:p>
+            <w:pPr>
+              <w:pStyle w:val="Compact"/>
+              <w:jc w:val="left"/>
+            </w:pPr>
+            <w:r>
+              <w:rPr>
+                <w:b/>
+                <w:sz w:val="19"/>
+              </w:rPr>
+              <w:t xml:space="preserve">Limit</w:t>
+            </w:r>
+          </w:p>
+        </w:tc>
+      </w:tr>
+      <w:tr>
+        <w:tc>
+          <w:tcPr/>
+          <w:p>
+            <w:pPr>
+              <w:pStyle w:val="Compact"/>
+              <w:jc w:val="left"/>
+            </w:pPr>
+            <w:r>
+              <w:rPr>
+                <w:b/>
+                <w:sz w:val="19"/>
+              </w:rPr>
+              <w:t xml:space="preserve">Raise one power by one Class</w:t>
+            </w:r>
+          </w:p>
+        </w:tc>
+        <w:tc>
+          <w:tcPr/>
+          <w:p>
+            <w:pPr>
+              <w:pStyle w:val="Compact"/>
+              <w:jc w:val="left"/>
+            </w:pPr>
+            <w:r>
+              <w:rPr>
+                <w:sz w:val="19"/>
+              </w:rPr>
+              <w:t xml:space="preserve">Up to Class III</w:t>
+            </w:r>
+          </w:p>
+        </w:tc>
+      </w:tr>
+      <w:tr>
+        <w:tc>
+          <w:tcPr/>
+          <w:p>
+            <w:pPr>
+              <w:pStyle w:val="Compact"/>
+              <w:jc w:val="left"/>
+            </w:pPr>
+            <w:r>
+              <w:rPr>
+                <w:b/>
+                <w:sz w:val="19"/>
+              </w:rPr>
+              <w:t xml:space="preserve">Learn a new power at Class I</w:t>
+            </w:r>
+          </w:p>
+        </w:tc>
+        <w:tc>
+          <w:tcPr/>
+          <w:p>
+            <w:pPr>
+              <w:pStyle w:val="Compact"/>
+              <w:jc w:val="left"/>
+            </w:pPr>
+            <w:r>
+              <w:rPr>
+                <w:sz w:val="19"/>
+              </w:rPr>
+              <w:t xml:space="preserve">Needs a story reason: a ritual, an exposure, Ambrosia, a bond that deepens</w:t>
+            </w:r>
+          </w:p>
+        </w:tc>
+      </w:tr>
+      <w:tr>
+        <w:tc>
+          <w:tcPr/>
+          <w:p>
+            <w:pPr>
+              <w:pStyle w:val="Compact"/>
+              <w:jc w:val="left"/>
+            </w:pPr>
+            <w:r>
+              <w:rPr>
+                <w:b/>
+                <w:sz w:val="19"/>
+              </w:rPr>
+              <w:t xml:space="preserve">Raise a Class III power to</w:t>
+            </w:r>
+            <w:r>
+              <w:rPr>
+                <w:b/>
+                <w:sz w:val="19"/>
+              </w:rPr>
+              <w:t xml:space="preserve"> </w:t>
+            </w:r>
+            <w:r>
+              <w:rPr>
+                <w:bCs/>
+                <w:b/>
+                <w:sz w:val="19"/>
+              </w:rPr>
+              <w:t xml:space="preserve">Class IV</w:t>
+            </w:r>
+          </w:p>
+        </w:tc>
+        <w:tc>
+          <w:tcPr/>
+          <w:p>
+            <w:pPr>
+              <w:pStyle w:val="Compact"/>
+              <w:jc w:val="left"/>
+            </w:pPr>
+            <w:r>
+              <w:rPr>
+                <w:sz w:val="19"/>
+              </w:rPr>
+              <w:t xml:space="preserve">Once per campaign, at a major story turning point, with the GM’s approval; costs two advancements</w:t>
+            </w:r>
+          </w:p>
+        </w:tc>
+      </w:tr>
+      <w:tr>
+        <w:tc>
+          <w:tcPr/>
+          <w:p>
+            <w:pPr>
+              <w:pStyle w:val="Compact"/>
+              <w:jc w:val="left"/>
+            </w:pPr>
+            <w:r>
+              <w:rPr>
+                <w:bCs/>
+                <w:b/>
+                <w:sz w:val="19"/>
+              </w:rPr>
+              <w:t xml:space="preserve">Class V</w:t>
+            </w:r>
+          </w:p>
+        </w:tc>
+        <w:tc>
+          <w:tcPr/>
+          <w:p>
+            <w:pPr>
+              <w:pStyle w:val="Compact"/>
+              <w:jc w:val="left"/>
+            </w:pPr>
+            <w:r>
+              <w:rPr>
+                <w:sz w:val="19"/>
+              </w:rPr>
+              <w:t xml:space="preserve">Only at the end of a long campaign, as the climax of a character’s story</w:t>
+            </w:r>
+          </w:p>
+        </w:tc>
+      </w:tr>
+    </w:tbl>
+    <w:p>
+      <w:pPr>
+        <w:pStyle w:val="BodyText"/>
+      </w:pPr>
+      <w:r>
+        <w:rPr>
+          <w:bCs/>
+          <w:b/>
+        </w:rPr>
+        <w:t xml:space="preserve">Class VI</w:t>
+      </w:r>
+      <w:r>
+        <w:t xml:space="preserve"> </w:t>
+      </w:r>
+      <w:r>
+        <w:t xml:space="preserve">stays with the GM’s characters. Until then, pushing (one action, one box of Strain) is how a character briefly reaches the Class above their own. Record grown and newly learned powers in the creator’s step 4, under</w:t>
+      </w:r>
+      <w:r>
+        <w:t xml:space="preserve"> </w:t>
+      </w:r>
+      <w:r>
+        <w:rPr>
+          <w:iCs/>
+          <w:i/>
+        </w:rPr>
+        <w:t xml:space="preserve">Powers grown in play</w:t>
+      </w:r>
+      <w:r>
+        <w:t xml:space="preserve">.</w:t>
+      </w:r>
+    </w:p>
+    <w:bookmarkEnd w:id="84"/>
+    <w:bookmarkStart w:id="85" w:name="the-powers"/>
+    <w:p>
+      <w:pPr>
+        <w:pStyle w:val="Heading2"/>
+      </w:pPr>
+      <w:r>
         <w:t xml:space="preserve">The powers</w:t>
       </w:r>
     </w:p>
-    <w:bookmarkEnd w:id="84"/>
-    <w:bookmarkStart w:id="85" w:name="energy-and-attack"/>
+    <w:bookmarkEnd w:id="85"/>
+    <w:bookmarkStart w:id="86" w:name="energy-and-attack"/>
     <w:p>
       <w:pPr>
         <w:pStyle w:val="Heading2"/>
@@ -16773,8 +17044,8 @@
         </w:tc>
       </w:tr>
     </w:tbl>
-    <w:bookmarkEnd w:id="85"/>
-    <w:bookmarkStart w:id="86" w:name="body-and-movement"/>
+    <w:bookmarkEnd w:id="86"/>
+    <w:bookmarkStart w:id="87" w:name="body-and-movement"/>
     <w:p>
       <w:pPr>
         <w:pStyle w:val="Heading2"/>
@@ -17952,8 +18223,8 @@
         </w:tc>
       </w:tr>
     </w:tbl>
-    <w:bookmarkEnd w:id="86"/>
-    <w:bookmarkStart w:id="87" w:name="mind-and-senses"/>
+    <w:bookmarkEnd w:id="87"/>
+    <w:bookmarkStart w:id="88" w:name="mind-and-senses"/>
     <w:p>
       <w:pPr>
         <w:pStyle w:val="Heading2"/>
@@ -18861,8 +19132,8 @@
         </w:tc>
       </w:tr>
     </w:tbl>
-    <w:bookmarkEnd w:id="87"/>
-    <w:bookmarkStart w:id="88" w:name="control-and-the-strange"/>
+    <w:bookmarkEnd w:id="88"/>
+    <w:bookmarkStart w:id="89" w:name="control-and-the-strange"/>
     <w:p>
       <w:pPr>
         <w:pStyle w:val="Heading2"/>
@@ -19914,8 +20185,8 @@
         </w:tc>
       </w:tr>
     </w:tbl>
-    <w:bookmarkEnd w:id="88"/>
-    <w:bookmarkStart w:id="89" w:name="escalated-classes"/>
+    <w:bookmarkEnd w:id="89"/>
+    <w:bookmarkStart w:id="90" w:name="escalated-classes"/>
     <w:p>
       <w:pPr>
         <w:pStyle w:val="Heading2"/>
@@ -20159,8 +20430,8 @@
         </w:tc>
       </w:tr>
     </w:tbl>
-    <w:bookmarkEnd w:id="89"/>
-    <w:bookmarkStart w:id="90" w:name="rituals"/>
+    <w:bookmarkEnd w:id="90"/>
+    <w:bookmarkStart w:id="91" w:name="rituals"/>
     <w:p>
       <w:pPr>
         <w:pStyle w:val="Heading2"/>
@@ -21069,8 +21340,8 @@
         <w:t xml:space="preserve">Without fuel, a ritual fails before it begins. Fuel taken from an unwilling person works, and is exactly how the Foundation and Raster Zero do it; for player characters it’s a crime under the EPA, and a black mark on any Adept.</w:t>
       </w:r>
     </w:p>
-    <w:bookmarkEnd w:id="90"/>
-    <w:bookmarkStart w:id="91" w:name="aegis-suits"/>
+    <w:bookmarkEnd w:id="91"/>
+    <w:bookmarkStart w:id="92" w:name="aegis-suits"/>
     <w:p>
       <w:pPr>
         <w:pStyle w:val="Heading2"/>
@@ -21148,8 +21419,8 @@
         <w:t xml:space="preserve">fired with Firearms. Suiting up takes a minute. A shot at the power pack (−2 to aim) that gets through shuts the suit down until it’s repaired with Engineering. The suits belong to ExLAW, or to whoever stole one.</w:t>
       </w:r>
     </w:p>
-    <w:bookmarkEnd w:id="91"/>
-    <w:bookmarkStart w:id="92" w:name="the-labs-want-you"/>
+    <w:bookmarkEnd w:id="92"/>
+    <w:bookmarkStart w:id="93" w:name="the-labs-want-you"/>
     <w:p>
       <w:pPr>
         <w:pStyle w:val="Heading2"/>
@@ -21166,9 +21437,9 @@
         <w:t xml:space="preserve">A character with a Class III power, or any (GM) power, draws interest from the Foundation and Raster Zero. That interest is a story hook, not a rule.</w:t>
       </w:r>
     </w:p>
-    <w:bookmarkEnd w:id="92"/>
     <w:bookmarkEnd w:id="93"/>
-    <w:bookmarkStart w:id="94" w:name="factions"/>
+    <w:bookmarkEnd w:id="94"/>
+    <w:bookmarkStart w:id="95" w:name="factions"/>
     <w:p>
       <w:pPr>
         <w:pStyle w:val="Heading1"/>
@@ -21620,8 +21891,8 @@
         <w:t xml:space="preserve">The dark reflection of our world, sending duplicates through the thinning walls.</w:t>
       </w:r>
     </w:p>
-    <w:bookmarkEnd w:id="94"/>
-    <w:bookmarkStart w:id="95" w:name="otherworld-and-shadow-earth"/>
+    <w:bookmarkEnd w:id="95"/>
+    <w:bookmarkStart w:id="96" w:name="otherworld-and-shadow-earth"/>
     <w:p>
       <w:pPr>
         <w:pStyle w:val="Heading1"/>
@@ -21798,8 +22069,8 @@
         <w:t xml:space="preserve">of our own people, who serve as the rulers’ minions. Since 2012 the walls have been thin, and more of them get through every year.</w:t>
       </w:r>
     </w:p>
-    <w:bookmarkEnd w:id="95"/>
-    <w:bookmarkStart w:id="96" w:name="notable-operants"/>
+    <w:bookmarkEnd w:id="96"/>
+    <w:bookmarkStart w:id="97" w:name="notable-operants"/>
     <w:p>
       <w:pPr>
         <w:pStyle w:val="Heading1"/>
@@ -22369,8 +22640,8 @@
         <w:t xml:space="preserve">Once an adjunct professor of comparative folklore in New York, obsessed with a single current of power he believed older than civilization. In a university archive he found untranslated manuscripts in a 19th-century occultist’s papers: a ritual encoded in language itself. He spoke the words aloud, and his mind opened for a few burning moments to the raw currents of Otherworld. It shattered him. He lost his job and his name, and wanders New York’s alleys and subway tunnels muttering. Yet his chalk sigils ward whole stations by accident, his ramblings predict murders and market crashes, pigeons land on his shoulders as if awaiting orders, and children sometimes see a crown of burning letters over his head. He is part prophet, part lunatic, part guardian and part danger.</w:t>
       </w:r>
     </w:p>
-    <w:bookmarkEnd w:id="96"/>
-    <w:bookmarkStart w:id="97" w:name="threats"/>
+    <w:bookmarkEnd w:id="97"/>
+    <w:bookmarkStart w:id="98" w:name="threats"/>
     <w:p>
       <w:pPr>
         <w:pStyle w:val="Heading1"/>
@@ -24608,8 +24879,8 @@
         <w:t xml:space="preserve">For a tougher version, add +1 to its targets and one box, or raise a power one Class; for a weaker one, subtract.</w:t>
       </w:r>
     </w:p>
-    <w:bookmarkEnd w:id="97"/>
-    <w:bookmarkStart w:id="105" w:name="ready-made-characters"/>
+    <w:bookmarkEnd w:id="98"/>
+    <w:bookmarkStart w:id="106" w:name="ready-made-characters"/>
     <w:p>
       <w:pPr>
         <w:pStyle w:val="Heading1"/>
@@ -24626,7 +24897,7 @@
         <w:t xml:space="preserve">Characters ready to play, for one-shots, new players, or a group in a hurry. Each follows the creation rules exactly, and their connections tie them together. In the creator, choose one from the ready-made list to open it and make it your own.</w:t>
       </w:r>
     </w:p>
-    <w:bookmarkStart w:id="98" w:name="rachel-kwan"/>
+    <w:bookmarkStart w:id="99" w:name="rachel-kwan"/>
     <w:p>
       <w:pPr>
         <w:pStyle w:val="Heading2"/>
@@ -24855,8 +25126,8 @@
         <w:t xml:space="preserve">Jess Calloway is the only reporter who asked about her missing partner. Kwan hasn’t decided whether to trust her.</w:t>
       </w:r>
     </w:p>
-    <w:bookmarkEnd w:id="98"/>
-    <w:bookmarkStart w:id="99" w:name="luis-bulldog-ortega"/>
+    <w:bookmarkEnd w:id="99"/>
+    <w:bookmarkStart w:id="100" w:name="luis-bulldog-ortega"/>
     <w:p>
       <w:pPr>
         <w:pStyle w:val="Heading2"/>
@@ -25081,8 +25352,8 @@
         <w:t xml:space="preserve">He flew cover for Rachel Kwan the night her partner vanished, and saw something he never put in the report.</w:t>
       </w:r>
     </w:p>
-    <w:bookmarkEnd w:id="99"/>
-    <w:bookmarkStart w:id="100" w:name="naomi-price"/>
+    <w:bookmarkEnd w:id="100"/>
+    <w:bookmarkStart w:id="101" w:name="naomi-price"/>
     <w:p>
       <w:pPr>
         <w:pStyle w:val="Heading2"/>
@@ -25289,8 +25560,8 @@
         <w:t xml:space="preserve">Static saved her from a Foundation snatch team on live TV, and vanished before the cameras turned.</w:t>
       </w:r>
     </w:p>
-    <w:bookmarkEnd w:id="100"/>
-    <w:bookmarkStart w:id="101" w:name="dr.-tobias-wren"/>
+    <w:bookmarkEnd w:id="101"/>
+    <w:bookmarkStart w:id="102" w:name="dr.-tobias-wren"/>
     <w:p>
       <w:pPr>
         <w:pStyle w:val="Heading2"/>
@@ -25519,8 +25790,8 @@
         <w:t xml:space="preserve">He taught Maeve Ashgrove’s handler, and was the one who recognized what Maeve really is.</w:t>
       </w:r>
     </w:p>
-    <w:bookmarkEnd w:id="101"/>
-    <w:bookmarkStart w:id="102" w:name="jess-calloway"/>
+    <w:bookmarkEnd w:id="102"/>
+    <w:bookmarkStart w:id="103" w:name="jess-calloway"/>
     <w:p>
       <w:pPr>
         <w:pStyle w:val="Heading2"/>
@@ -25749,8 +26020,8 @@
         <w:t xml:space="preserve">Rachel Kwan’s missing partner was her source. She hasn’t told Kwan yet.</w:t>
       </w:r>
     </w:p>
-    <w:bookmarkEnd w:id="102"/>
-    <w:bookmarkStart w:id="103" w:name="subject-19"/>
+    <w:bookmarkEnd w:id="103"/>
+    <w:bookmarkStart w:id="104" w:name="subject-19"/>
     <w:p>
       <w:pPr>
         <w:pStyle w:val="Heading2"/>
@@ -26000,8 +26271,8 @@
         <w:t xml:space="preserve">Saved Daybreak from a Foundation snatch team on live TV, and ran before the cameras turned.</w:t>
       </w:r>
     </w:p>
-    <w:bookmarkEnd w:id="103"/>
-    <w:bookmarkStart w:id="104" w:name="maeve-ashgrove"/>
+    <w:bookmarkEnd w:id="104"/>
+    <w:bookmarkStart w:id="105" w:name="maeve-ashgrove"/>
     <w:p>
       <w:pPr>
         <w:pStyle w:val="Heading2"/>
@@ -26230,9 +26501,9 @@
         <w:t xml:space="preserve">Dr. Tobias Wren saw through her glamour the first day. He’s kept her secret; she wonders what it’ll cost.</w:t>
       </w:r>
     </w:p>
-    <w:bookmarkEnd w:id="104"/>
     <w:bookmarkEnd w:id="105"/>
-    <w:bookmarkStart w:id="106" w:name="advantages"/>
+    <w:bookmarkEnd w:id="106"/>
+    <w:bookmarkStart w:id="107" w:name="advantages"/>
     <w:p>
       <w:pPr>
         <w:pStyle w:val="Heading1"/>
@@ -27086,8 +27357,8 @@
         <w:t xml:space="preserve">complication unless the GM agrees otherwise. Origin advantages (in each origin’s entry) are often the most flavorful choice for an Operant.</w:t>
       </w:r>
     </w:p>
-    <w:bookmarkEnd w:id="106"/>
-    <w:bookmarkStart w:id="117" w:name="origins"/>
+    <w:bookmarkEnd w:id="107"/>
+    <w:bookmarkStart w:id="118" w:name="origins"/>
     <w:p>
       <w:pPr>
         <w:pStyle w:val="Heading1"/>
@@ -27825,7 +28096,7 @@
         </w:tc>
       </w:tr>
     </w:tbl>
-    <w:bookmarkStart w:id="107" w:name="non-operant"/>
+    <w:bookmarkStart w:id="108" w:name="non-operant"/>
     <w:p>
       <w:pPr>
         <w:pStyle w:val="Heading2"/>
@@ -28174,8 +28445,8 @@
         </w:tc>
       </w:tr>
     </w:tbl>
-    <w:bookmarkEnd w:id="107"/>
-    <w:bookmarkStart w:id="108" w:name="adept"/>
+    <w:bookmarkEnd w:id="108"/>
+    <w:bookmarkStart w:id="109" w:name="adept"/>
     <w:p>
       <w:pPr>
         <w:pStyle w:val="Heading2"/>
@@ -28536,8 +28807,8 @@
         </w:tc>
       </w:tr>
     </w:tbl>
-    <w:bookmarkEnd w:id="108"/>
-    <w:bookmarkStart w:id="109" w:name="aurora-born"/>
+    <w:bookmarkEnd w:id="109"/>
+    <w:bookmarkStart w:id="110" w:name="aurora-born"/>
     <w:p>
       <w:pPr>
         <w:pStyle w:val="Heading2"/>
@@ -28886,8 +29157,8 @@
         </w:tc>
       </w:tr>
     </w:tbl>
-    <w:bookmarkEnd w:id="109"/>
-    <w:bookmarkStart w:id="110" w:name="bonded"/>
+    <w:bookmarkEnd w:id="110"/>
+    <w:bookmarkStart w:id="111" w:name="bonded"/>
     <w:p>
       <w:pPr>
         <w:pStyle w:val="Heading2"/>
@@ -29248,8 +29519,8 @@
         </w:tc>
       </w:tr>
     </w:tbl>
-    <w:bookmarkEnd w:id="110"/>
-    <w:bookmarkStart w:id="111" w:name="lab-made"/>
+    <w:bookmarkEnd w:id="111"/>
+    <w:bookmarkStart w:id="112" w:name="lab-made"/>
     <w:p>
       <w:pPr>
         <w:pStyle w:val="Heading2"/>
@@ -29598,8 +29869,8 @@
         </w:tc>
       </w:tr>
     </w:tbl>
-    <w:bookmarkEnd w:id="111"/>
-    <w:bookmarkStart w:id="112" w:name="otherworlder"/>
+    <w:bookmarkEnd w:id="112"/>
+    <w:bookmarkStart w:id="113" w:name="otherworlder"/>
     <w:p>
       <w:pPr>
         <w:pStyle w:val="Heading2"/>
@@ -29948,8 +30219,8 @@
         </w:tc>
       </w:tr>
     </w:tbl>
-    <w:bookmarkEnd w:id="112"/>
-    <w:bookmarkStart w:id="113" w:name="shadow-earth-defector"/>
+    <w:bookmarkEnd w:id="113"/>
+    <w:bookmarkStart w:id="114" w:name="shadow-earth-defector"/>
     <w:p>
       <w:pPr>
         <w:pStyle w:val="Heading2"/>
@@ -30310,8 +30581,8 @@
         </w:tc>
       </w:tr>
     </w:tbl>
-    <w:bookmarkEnd w:id="113"/>
-    <w:bookmarkStart w:id="114" w:name="touched"/>
+    <w:bookmarkEnd w:id="114"/>
+    <w:bookmarkStart w:id="115" w:name="touched"/>
     <w:p>
       <w:pPr>
         <w:pStyle w:val="Heading2"/>
@@ -30675,8 +30946,8 @@
         </w:tc>
       </w:tr>
     </w:tbl>
-    <w:bookmarkEnd w:id="114"/>
-    <w:bookmarkStart w:id="115" w:name="ambrosia"/>
+    <w:bookmarkEnd w:id="115"/>
+    <w:bookmarkStart w:id="116" w:name="ambrosia"/>
     <w:p>
       <w:pPr>
         <w:pStyle w:val="Heading2"/>
@@ -31037,8 +31308,8 @@
         </w:tc>
       </w:tr>
     </w:tbl>
-    <w:bookmarkEnd w:id="115"/>
-    <w:bookmarkStart w:id="116" w:name="mythic"/>
+    <w:bookmarkEnd w:id="116"/>
+    <w:bookmarkStart w:id="117" w:name="mythic"/>
     <w:p>
       <w:pPr>
         <w:pStyle w:val="Heading2"/>
@@ -31399,9 +31670,9 @@
         </w:tc>
       </w:tr>
     </w:tbl>
-    <w:bookmarkEnd w:id="116"/>
     <w:bookmarkEnd w:id="117"/>
-    <w:bookmarkStart w:id="128" w:name="making-your-own"/>
+    <w:bookmarkEnd w:id="118"/>
+    <w:bookmarkStart w:id="129" w:name="making-your-own"/>
     <w:p>
       <w:pPr>
         <w:pStyle w:val="Heading1"/>
@@ -31434,7 +31705,7 @@
         <w:t xml:space="preserve">option at the end of each list, and its checklist holds a custom choice to the same rules as everything else.</w:t>
       </w:r>
     </w:p>
-    <w:bookmarkStart w:id="118" w:name="a-custom-calling"/>
+    <w:bookmarkStart w:id="119" w:name="a-custom-calling"/>
     <w:p>
       <w:pPr>
         <w:pStyle w:val="Heading2"/>
@@ -31610,8 +31881,8 @@
         <w:t xml:space="preserve">.</w:t>
       </w:r>
     </w:p>
-    <w:bookmarkEnd w:id="118"/>
-    <w:bookmarkStart w:id="127" w:name="a-custom-origin"/>
+    <w:bookmarkEnd w:id="119"/>
+    <w:bookmarkStart w:id="128" w:name="a-custom-origin"/>
     <w:p>
       <w:pPr>
         <w:pStyle w:val="Heading2"/>
@@ -31628,7 +31899,7 @@
         <w:t xml:space="preserve">Build it with the GM, one step at a time.</w:t>
       </w:r>
     </w:p>
-    <w:bookmarkStart w:id="119" w:name="the-concept"/>
+    <w:bookmarkStart w:id="120" w:name="the-concept"/>
     <w:p>
       <w:pPr>
         <w:pStyle w:val="Heading3"/>
@@ -31645,8 +31916,8 @@
         <w:t xml:space="preserve">Two or three sentences: where they come from, what sets them apart, and how others see them. It should be something the origins in this book don’t already cover.</w:t>
       </w:r>
     </w:p>
-    <w:bookmarkEnd w:id="119"/>
-    <w:bookmarkStart w:id="120" w:name="the-tier"/>
+    <w:bookmarkEnd w:id="120"/>
+    <w:bookmarkStart w:id="121" w:name="the-tier"/>
     <w:p>
       <w:pPr>
         <w:pStyle w:val="Heading3"/>
@@ -31943,8 +32214,8 @@
         <w:t xml:space="preserve">When in doubt, choose the higher tier.</w:t>
       </w:r>
     </w:p>
-    <w:bookmarkEnd w:id="120"/>
-    <w:bookmarkStart w:id="121" w:name="attribute-adjustments"/>
+    <w:bookmarkEnd w:id="121"/>
+    <w:bookmarkStart w:id="122" w:name="attribute-adjustments"/>
     <w:p>
       <w:pPr>
         <w:pStyle w:val="Heading3"/>
@@ -31990,8 +32261,8 @@
         <w:t xml:space="preserve">: a +2 needs a −2 or two −1s. The adjustments move the attribute’s base (+1 starts it at 11) and raise its starting maximum (13 plus the bonus). Most origins change two to four attributes.</w:t>
       </w:r>
     </w:p>
-    <w:bookmarkEnd w:id="121"/>
-    <w:bookmarkStart w:id="122" w:name="core-rules-tier-1-and-up"/>
+    <w:bookmarkEnd w:id="122"/>
+    <w:bookmarkStart w:id="123" w:name="core-rules-tier-1-and-up"/>
     <w:p>
       <w:pPr>
         <w:pStyle w:val="Heading3"/>
@@ -32008,8 +32279,8 @@
         <w:t xml:space="preserve">One to three short rules that always apply: what they can do (see in the dark, resist cold, a free Trained skill) and what it costs (a weakness, a people’s distrust, a hazard they can’t abide). A strength with no drawback is worth more than it looks, so price it a tier higher.</w:t>
       </w:r>
     </w:p>
-    <w:bookmarkEnd w:id="122"/>
-    <w:bookmarkStart w:id="123" w:name="origin-advantages"/>
+    <w:bookmarkEnd w:id="123"/>
+    <w:bookmarkStart w:id="124" w:name="origin-advantages"/>
     <w:p>
       <w:pPr>
         <w:pStyle w:val="Heading3"/>
@@ -32064,8 +32335,8 @@
         <w:t xml:space="preserve">: a problem the trait causes, with a clear trigger and a real consequence, which earns a Spark point when it bites, like any complication. A character takes one advantage, general or origin, so make them distinct choices.</w:t>
       </w:r>
     </w:p>
-    <w:bookmarkEnd w:id="123"/>
-    <w:bookmarkStart w:id="124" w:name="an-alternate-form-optional-tier-2-or-3"/>
+    <w:bookmarkEnd w:id="124"/>
+    <w:bookmarkStart w:id="125" w:name="an-alternate-form-optional-tier-2-or-3"/>
     <w:p>
       <w:pPr>
         <w:pStyle w:val="Heading3"/>
@@ -32098,8 +32369,8 @@
         <w:t xml:space="preserve">apply.</w:t>
       </w:r>
     </w:p>
-    <w:bookmarkEnd w:id="124"/>
-    <w:bookmarkStart w:id="125" w:name="in-the-creator"/>
+    <w:bookmarkEnd w:id="125"/>
+    <w:bookmarkStart w:id="126" w:name="in-the-creator"/>
     <w:p>
       <w:pPr>
         <w:pStyle w:val="Heading3"/>
@@ -32204,8 +32475,8 @@
         <w:t xml:space="preserve">and enter the advantage and its companion complication.</w:t>
       </w:r>
     </w:p>
-    <w:bookmarkEnd w:id="125"/>
-    <w:bookmarkStart w:id="126" w:name="example"/>
+    <w:bookmarkEnd w:id="126"/>
+    <w:bookmarkStart w:id="127" w:name="example"/>
     <w:p>
       <w:pPr>
         <w:pStyle w:val="Heading3"/>
@@ -32326,10 +32597,10 @@
         <w:t xml:space="preserve">one at Class II, two at Class I.</w:t>
       </w:r>
     </w:p>
-    <w:bookmarkEnd w:id="126"/>
     <w:bookmarkEnd w:id="127"/>
     <w:bookmarkEnd w:id="128"/>
-    <w:bookmarkStart w:id="129" w:name="complications"/>
+    <w:bookmarkEnd w:id="129"/>
+    <w:bookmarkStart w:id="130" w:name="complications"/>
     <w:p>
       <w:pPr>
         <w:pStyle w:val="Heading1"/>
@@ -33034,8 +33305,8 @@
         </w:tc>
       </w:tr>
     </w:tbl>
-    <w:bookmarkEnd w:id="129"/>
-    <w:bookmarkStart w:id="131" w:name="quick-reference"/>
+    <w:bookmarkEnd w:id="130"/>
+    <w:bookmarkStart w:id="132" w:name="quick-reference"/>
     <w:p>
       <w:pPr>
         <w:pStyle w:val="Heading1"/>
@@ -33226,7 +33497,7 @@
       <w:r>
         <w:t xml:space="preserve"> </w:t>
       </w:r>
-      <w:hyperlink r:id="rId130">
+      <w:hyperlink r:id="rId131">
         <w:r>
           <w:rPr>
             <w:rStyle w:val="Hyperlink"/>
@@ -33238,7 +33509,7 @@
         <w:t xml:space="preserve">. You may share, adapt, and use it for any purpose, including commercially, as long as you give appropriate credit to the author.</w:t>
       </w:r>
     </w:p>
-    <w:bookmarkEnd w:id="131"/>
+    <w:bookmarkEnd w:id="132"/>
     <w:sectPr/>
   </w:body>
 </w:document>

</xml_diff>